<commit_message>
DAT-44: strip submission checklist from Workbook 1
Remove non-report appendix tables and meta notes so T4.A4.docx is
submission-ready.
</commit_message>
<xml_diff>
--- a/docs/reports/T4.A4.docx
+++ b/docs/reports/T4.A4.docx
@@ -22200,7 +22200,7 @@
           <w:sz w:val="22"/>
           <w:szCs w:val="22"/>
         </w:rPr>
-        <w:t>[16] A. Yang et al., "Qwen3 technical report," arXiv:2505.09388, 2025. (Project configs use Qwen3.5-4B instruct weights.)</w:t>
+        <w:t>[16] A. Yang et al., "Qwen3 technical report," arXiv:2505.09388, 2025.</w:t>
       </w:r>
     </w:p>
     <w:p>
@@ -22217,1416 +22217,6 @@
         <w:t xml:space="preserve">[17] K. Zhu et al., "MultiAgentBench: Evaluating the collaboration and competition of LLM agents," arXiv:2503.01935, 2025.</w:t>
       </w:r>
     </w:p>
-    <w:p>
-      <w:pPr>
-        <w:pStyle w:val="Heading1"/>
-        <w:spacing w:after="140" w:before="280"/>
-      </w:pPr>
-      <w:r>
-        <w:rPr>
-          <w:rFonts w:ascii="Times New Roman" w:cs="Times New Roman" w:eastAsia="Times New Roman" w:hAnsi="Times New Roman"/>
-          <w:b/>
-          <w:bCs/>
-          <w:sz w:val="28"/>
-          <w:szCs w:val="28"/>
-        </w:rPr>
-        <w:t xml:space="preserve">Submission checklist (not part of the report)</w:t>
-      </w:r>
-    </w:p>
-    <w:tbl>
-      <w:tblPr>
-        <w:tblW w:type="dxa" w:w="9360"/>
-        <w:tblBorders>
-          <w:top w:val="single" w:color="auto" w:sz="4"/>
-          <w:left w:val="single" w:color="auto" w:sz="4"/>
-          <w:bottom w:val="single" w:color="auto" w:sz="4"/>
-          <w:right w:val="single" w:color="auto" w:sz="4"/>
-          <w:insideH w:val="single" w:color="auto" w:sz="4"/>
-          <w:insideV w:val="single" w:color="auto" w:sz="4"/>
-        </w:tblBorders>
-      </w:tblPr>
-      <w:tblGrid>
-        <w:gridCol w:w="7841"/>
-        <w:gridCol w:w="1519"/>
-      </w:tblGrid>
-      <w:tr>
-        <w:trPr>
-          <w:tblHeader/>
-        </w:trPr>
-        <w:tc>
-          <w:tcPr>
-            <w:tcW w:type="dxa" w:w="7841"/>
-            <w:tcBorders>
-              <w:top w:val="single" w:color="808080" w:sz="4"/>
-              <w:left w:val="single" w:color="808080" w:sz="4"/>
-              <w:bottom w:val="single" w:color="808080" w:sz="4"/>
-              <w:right w:val="single" w:color="808080" w:sz="4"/>
-            </w:tcBorders>
-            <w:shd w:fill="D9E2F3" w:color="auto" w:val="clear"/>
-            <w:tcMar>
-              <w:top w:type="dxa" w:w="50"/>
-              <w:left w:type="dxa" w:w="90"/>
-              <w:bottom w:type="dxa" w:w="50"/>
-              <w:right w:type="dxa" w:w="90"/>
-            </w:tcMar>
-          </w:tcPr>
-          <w:p>
-            <w:pPr>
-              <w:spacing w:after="20"/>
-            </w:pPr>
-            <w:r>
-              <w:rPr>
-                <w:rFonts w:ascii="Times New Roman" w:cs="Times New Roman" w:eastAsia="Times New Roman" w:hAnsi="Times New Roman"/>
-                <w:b/>
-                <w:bCs/>
-                <w:sz w:val="18"/>
-                <w:szCs w:val="18"/>
-              </w:rPr>
-              <w:t xml:space="preserve">Check</w:t>
-            </w:r>
-          </w:p>
-        </w:tc>
-        <w:tc>
-          <w:tcPr>
-            <w:tcW w:type="dxa" w:w="1519"/>
-            <w:tcBorders>
-              <w:top w:val="single" w:color="808080" w:sz="4"/>
-              <w:left w:val="single" w:color="808080" w:sz="4"/>
-              <w:bottom w:val="single" w:color="808080" w:sz="4"/>
-              <w:right w:val="single" w:color="808080" w:sz="4"/>
-            </w:tcBorders>
-            <w:shd w:fill="D9E2F3" w:color="auto" w:val="clear"/>
-            <w:tcMar>
-              <w:top w:type="dxa" w:w="50"/>
-              <w:left w:type="dxa" w:w="90"/>
-              <w:bottom w:type="dxa" w:w="50"/>
-              <w:right w:type="dxa" w:w="90"/>
-            </w:tcMar>
-          </w:tcPr>
-          <w:p>
-            <w:pPr>
-              <w:spacing w:after="20"/>
-            </w:pPr>
-            <w:r>
-              <w:rPr>
-                <w:rFonts w:ascii="Times New Roman" w:cs="Times New Roman" w:eastAsia="Times New Roman" w:hAnsi="Times New Roman"/>
-                <w:b/>
-                <w:bCs/>
-                <w:sz w:val="18"/>
-                <w:szCs w:val="18"/>
-              </w:rPr>
-              <w:t xml:space="preserve">Yes / No</w:t>
-            </w:r>
-          </w:p>
-        </w:tc>
-      </w:tr>
-      <w:tr>
-        <w:trPr>
-          <w:cantSplit/>
-        </w:trPr>
-        <w:tc>
-          <w:tcPr>
-            <w:tcW w:type="dxa" w:w="7841"/>
-            <w:tcBorders>
-              <w:top w:val="single" w:color="808080" w:sz="4"/>
-              <w:left w:val="single" w:color="808080" w:sz="4"/>
-              <w:bottom w:val="single" w:color="808080" w:sz="4"/>
-              <w:right w:val="single" w:color="808080" w:sz="4"/>
-            </w:tcBorders>
-            <w:tcMar>
-              <w:top w:type="dxa" w:w="50"/>
-              <w:left w:type="dxa" w:w="90"/>
-              <w:bottom w:type="dxa" w:w="50"/>
-              <w:right w:type="dxa" w:w="90"/>
-            </w:tcMar>
-          </w:tcPr>
-          <w:p>
-            <w:pPr>
-              <w:spacing w:after="20"/>
-            </w:pPr>
-            <w:r>
-              <w:rPr>
-                <w:rFonts w:ascii="Times New Roman" w:cs="Times New Roman" w:eastAsia="Times New Roman" w:hAnsi="Times New Roman"/>
-                <w:sz w:val="18"/>
-                <w:szCs w:val="18"/>
-              </w:rPr>
-              <w:t xml:space="preserve">Every section above is written as report prose, not as notes</w:t>
-            </w:r>
-          </w:p>
-        </w:tc>
-        <w:tc>
-          <w:tcPr>
-            <w:tcW w:type="dxa" w:w="1519"/>
-            <w:tcBorders>
-              <w:top w:val="single" w:color="808080" w:sz="4"/>
-              <w:left w:val="single" w:color="808080" w:sz="4"/>
-              <w:bottom w:val="single" w:color="808080" w:sz="4"/>
-              <w:right w:val="single" w:color="808080" w:sz="4"/>
-            </w:tcBorders>
-            <w:tcMar>
-              <w:top w:type="dxa" w:w="50"/>
-              <w:left w:type="dxa" w:w="90"/>
-              <w:bottom w:type="dxa" w:w="50"/>
-              <w:right w:type="dxa" w:w="90"/>
-            </w:tcMar>
-          </w:tcPr>
-          <w:p>
-            <w:pPr>
-              <w:spacing w:after="20"/>
-            </w:pPr>
-            <w:r>
-              <w:rPr>
-                <w:rFonts w:ascii="Times New Roman" w:cs="Times New Roman" w:eastAsia="Times New Roman" w:hAnsi="Times New Roman"/>
-                <w:sz w:val="18"/>
-                <w:szCs w:val="18"/>
-              </w:rPr>
-              <w:t xml:space="preserve">Yes</w:t>
-            </w:r>
-          </w:p>
-        </w:tc>
-      </w:tr>
-      <w:tr>
-        <w:trPr>
-          <w:cantSplit/>
-        </w:trPr>
-        <w:tc>
-          <w:tcPr>
-            <w:tcW w:type="dxa" w:w="7841"/>
-            <w:tcBorders>
-              <w:top w:val="single" w:color="808080" w:sz="4"/>
-              <w:left w:val="single" w:color="808080" w:sz="4"/>
-              <w:bottom w:val="single" w:color="808080" w:sz="4"/>
-              <w:right w:val="single" w:color="808080" w:sz="4"/>
-            </w:tcBorders>
-            <w:tcMar>
-              <w:top w:type="dxa" w:w="50"/>
-              <w:left w:type="dxa" w:w="90"/>
-              <w:bottom w:type="dxa" w:w="50"/>
-              <w:right w:type="dxa" w:w="90"/>
-            </w:tcMar>
-          </w:tcPr>
-          <w:p>
-            <w:pPr>
-              <w:spacing w:after="20"/>
-            </w:pPr>
-            <w:r>
-              <w:rPr>
-                <w:rFonts w:ascii="Times New Roman" w:cs="Times New Roman" w:eastAsia="Times New Roman" w:hAnsi="Times New Roman"/>
-                <w:sz w:val="18"/>
-                <w:szCs w:val="18"/>
-              </w:rPr>
-              <w:t xml:space="preserve">Every claim links to a commit, run, dataset version or Linear issue</w:t>
-            </w:r>
-          </w:p>
-        </w:tc>
-        <w:tc>
-          <w:tcPr>
-            <w:tcW w:type="dxa" w:w="1519"/>
-            <w:tcBorders>
-              <w:top w:val="single" w:color="808080" w:sz="4"/>
-              <w:left w:val="single" w:color="808080" w:sz="4"/>
-              <w:bottom w:val="single" w:color="808080" w:sz="4"/>
-              <w:right w:val="single" w:color="808080" w:sz="4"/>
-            </w:tcBorders>
-            <w:tcMar>
-              <w:top w:type="dxa" w:w="50"/>
-              <w:left w:type="dxa" w:w="90"/>
-              <w:bottom w:type="dxa" w:w="50"/>
-              <w:right w:type="dxa" w:w="90"/>
-            </w:tcMar>
-          </w:tcPr>
-          <w:p>
-            <w:pPr>
-              <w:spacing w:after="20"/>
-            </w:pPr>
-            <w:r>
-              <w:rPr>
-                <w:rFonts w:ascii="Times New Roman" w:cs="Times New Roman" w:eastAsia="Times New Roman" w:hAnsi="Times New Roman"/>
-                <w:sz w:val="18"/>
-                <w:szCs w:val="18"/>
-              </w:rPr>
-              <w:t xml:space="preserve">[ ]</w:t>
-            </w:r>
-          </w:p>
-        </w:tc>
-      </w:tr>
-      <w:tr>
-        <w:trPr>
-          <w:cantSplit/>
-        </w:trPr>
-        <w:tc>
-          <w:tcPr>
-            <w:tcW w:type="dxa" w:w="7841"/>
-            <w:tcBorders>
-              <w:top w:val="single" w:color="808080" w:sz="4"/>
-              <w:left w:val="single" w:color="808080" w:sz="4"/>
-              <w:bottom w:val="single" w:color="808080" w:sz="4"/>
-              <w:right w:val="single" w:color="808080" w:sz="4"/>
-            </w:tcBorders>
-            <w:tcMar>
-              <w:top w:type="dxa" w:w="50"/>
-              <w:left w:type="dxa" w:w="90"/>
-              <w:bottom w:type="dxa" w:w="50"/>
-              <w:right w:type="dxa" w:w="90"/>
-            </w:tcMar>
-          </w:tcPr>
-          <w:p>
-            <w:pPr>
-              <w:spacing w:after="20"/>
-            </w:pPr>
-            <w:r>
-              <w:rPr>
-                <w:rFonts w:ascii="Times New Roman" w:cs="Times New Roman" w:eastAsia="Times New Roman" w:hAnsi="Times New Roman"/>
-                <w:sz w:val="18"/>
-                <w:szCs w:val="18"/>
-              </w:rPr>
-              <w:t xml:space="preserve">Every figure names the script or notebook that produced it</w:t>
-            </w:r>
-          </w:p>
-        </w:tc>
-        <w:tc>
-          <w:tcPr>
-            <w:tcW w:type="dxa" w:w="1519"/>
-            <w:tcBorders>
-              <w:top w:val="single" w:color="808080" w:sz="4"/>
-              <w:left w:val="single" w:color="808080" w:sz="4"/>
-              <w:bottom w:val="single" w:color="808080" w:sz="4"/>
-              <w:right w:val="single" w:color="808080" w:sz="4"/>
-            </w:tcBorders>
-            <w:tcMar>
-              <w:top w:type="dxa" w:w="50"/>
-              <w:left w:type="dxa" w:w="90"/>
-              <w:bottom w:type="dxa" w:w="50"/>
-              <w:right w:type="dxa" w:w="90"/>
-            </w:tcMar>
-          </w:tcPr>
-          <w:p>
-            <w:pPr>
-              <w:spacing w:after="20"/>
-            </w:pPr>
-            <w:r>
-              <w:rPr>
-                <w:rFonts w:ascii="Times New Roman" w:cs="Times New Roman" w:eastAsia="Times New Roman" w:hAnsi="Times New Roman"/>
-                <w:sz w:val="18"/>
-                <w:szCs w:val="18"/>
-              </w:rPr>
-              <w:t xml:space="preserve">[ ]</w:t>
-            </w:r>
-          </w:p>
-        </w:tc>
-      </w:tr>
-      <w:tr>
-        <w:trPr>
-          <w:cantSplit/>
-        </w:trPr>
-        <w:tc>
-          <w:tcPr>
-            <w:tcW w:type="dxa" w:w="7841"/>
-            <w:tcBorders>
-              <w:top w:val="single" w:color="808080" w:sz="4"/>
-              <w:left w:val="single" w:color="808080" w:sz="4"/>
-              <w:bottom w:val="single" w:color="808080" w:sz="4"/>
-              <w:right w:val="single" w:color="808080" w:sz="4"/>
-            </w:tcBorders>
-            <w:tcMar>
-              <w:top w:type="dxa" w:w="50"/>
-              <w:left w:type="dxa" w:w="90"/>
-              <w:bottom w:type="dxa" w:w="50"/>
-              <w:right w:type="dxa" w:w="90"/>
-            </w:tcMar>
-          </w:tcPr>
-          <w:p>
-            <w:pPr>
-              <w:spacing w:after="20"/>
-            </w:pPr>
-            <w:r>
-              <w:rPr>
-                <w:rFonts w:ascii="Times New Roman" w:cs="Times New Roman" w:eastAsia="Times New Roman" w:hAnsi="Times New Roman"/>
-                <w:sz w:val="18"/>
-                <w:szCs w:val="18"/>
-              </w:rPr>
-              <w:t xml:space="preserve">Every closed Linear issue for this period has a linked artifact</w:t>
-            </w:r>
-          </w:p>
-        </w:tc>
-        <w:tc>
-          <w:tcPr>
-            <w:tcW w:type="dxa" w:w="1519"/>
-            <w:tcBorders>
-              <w:top w:val="single" w:color="808080" w:sz="4"/>
-              <w:left w:val="single" w:color="808080" w:sz="4"/>
-              <w:bottom w:val="single" w:color="808080" w:sz="4"/>
-              <w:right w:val="single" w:color="808080" w:sz="4"/>
-            </w:tcBorders>
-            <w:tcMar>
-              <w:top w:type="dxa" w:w="50"/>
-              <w:left w:type="dxa" w:w="90"/>
-              <w:bottom w:type="dxa" w:w="50"/>
-              <w:right w:type="dxa" w:w="90"/>
-            </w:tcMar>
-          </w:tcPr>
-          <w:p>
-            <w:pPr>
-              <w:spacing w:after="20"/>
-            </w:pPr>
-            <w:r>
-              <w:rPr>
-                <w:rFonts w:ascii="Times New Roman" w:cs="Times New Roman" w:eastAsia="Times New Roman" w:hAnsi="Times New Roman"/>
-                <w:sz w:val="18"/>
-                <w:szCs w:val="18"/>
-              </w:rPr>
-              <w:t xml:space="preserve">[ ]</w:t>
-            </w:r>
-          </w:p>
-        </w:tc>
-      </w:tr>
-      <w:tr>
-        <w:trPr>
-          <w:cantSplit/>
-        </w:trPr>
-        <w:tc>
-          <w:tcPr>
-            <w:tcW w:type="dxa" w:w="7841"/>
-            <w:tcBorders>
-              <w:top w:val="single" w:color="808080" w:sz="4"/>
-              <w:left w:val="single" w:color="808080" w:sz="4"/>
-              <w:bottom w:val="single" w:color="808080" w:sz="4"/>
-              <w:right w:val="single" w:color="808080" w:sz="4"/>
-            </w:tcBorders>
-            <w:tcMar>
-              <w:top w:type="dxa" w:w="50"/>
-              <w:left w:type="dxa" w:w="90"/>
-              <w:bottom w:type="dxa" w:w="50"/>
-              <w:right w:type="dxa" w:w="90"/>
-            </w:tcMar>
-          </w:tcPr>
-          <w:p>
-            <w:pPr>
-              <w:spacing w:after="20"/>
-            </w:pPr>
-            <w:r>
-              <w:rPr>
-                <w:rFonts w:ascii="Times New Roman" w:cs="Times New Roman" w:eastAsia="Times New Roman" w:hAnsi="Times New Roman"/>
-                <w:sz w:val="18"/>
-                <w:szCs w:val="18"/>
-              </w:rPr>
-              <w:t xml:space="preserve">Each section names the team member who wrote it</w:t>
-            </w:r>
-          </w:p>
-        </w:tc>
-        <w:tc>
-          <w:tcPr>
-            <w:tcW w:type="dxa" w:w="1519"/>
-            <w:tcBorders>
-              <w:top w:val="single" w:color="808080" w:sz="4"/>
-              <w:left w:val="single" w:color="808080" w:sz="4"/>
-              <w:bottom w:val="single" w:color="808080" w:sz="4"/>
-              <w:right w:val="single" w:color="808080" w:sz="4"/>
-            </w:tcBorders>
-            <w:tcMar>
-              <w:top w:type="dxa" w:w="50"/>
-              <w:left w:type="dxa" w:w="90"/>
-              <w:bottom w:type="dxa" w:w="50"/>
-              <w:right w:type="dxa" w:w="90"/>
-            </w:tcMar>
-          </w:tcPr>
-          <w:p>
-            <w:pPr>
-              <w:spacing w:after="20"/>
-            </w:pPr>
-            <w:r>
-              <w:rPr>
-                <w:rFonts w:ascii="Times New Roman" w:cs="Times New Roman" w:eastAsia="Times New Roman" w:hAnsi="Times New Roman"/>
-                <w:sz w:val="18"/>
-                <w:szCs w:val="18"/>
-              </w:rPr>
-              <w:t xml:space="preserve">Yes</w:t>
-            </w:r>
-          </w:p>
-        </w:tc>
-      </w:tr>
-    </w:tbl>
-    <w:p>
-      <w:pPr>
-        <w:pStyle w:val="Heading1"/>
-        <w:spacing w:after="140" w:before="280"/>
-      </w:pPr>
-      <w:r>
-        <w:rPr>
-          <w:rFonts w:ascii="Times New Roman" w:cs="Times New Roman" w:eastAsia="Times New Roman" w:hAnsi="Times New Roman"/>
-          <w:b/>
-          <w:bCs/>
-          <w:sz w:val="28"/>
-          <w:szCs w:val="28"/>
-        </w:rPr>
-        <w:t xml:space="preserve">Self-assessment and gap register</w:t>
-      </w:r>
-    </w:p>
-    <w:tbl>
-      <w:tblPr>
-        <w:tblW w:type="dxa" w:w="9360"/>
-        <w:tblBorders>
-          <w:top w:val="single" w:color="auto" w:sz="4"/>
-          <w:left w:val="single" w:color="auto" w:sz="4"/>
-          <w:bottom w:val="single" w:color="auto" w:sz="4"/>
-          <w:right w:val="single" w:color="auto" w:sz="4"/>
-          <w:insideH w:val="single" w:color="auto" w:sz="4"/>
-          <w:insideV w:val="single" w:color="auto" w:sz="4"/>
-        </w:tblBorders>
-      </w:tblPr>
-      <w:tblGrid>
-        <w:gridCol w:w="2013"/>
-        <w:gridCol w:w="1589"/>
-        <w:gridCol w:w="3307"/>
-        <w:gridCol w:w="1104"/>
-        <w:gridCol w:w="1347"/>
-      </w:tblGrid>
-      <w:tr>
-        <w:trPr>
-          <w:tblHeader/>
-        </w:trPr>
-        <w:tc>
-          <w:tcPr>
-            <w:tcW w:type="dxa" w:w="2013"/>
-            <w:tcBorders>
-              <w:top w:val="single" w:color="808080" w:sz="4"/>
-              <w:left w:val="single" w:color="808080" w:sz="4"/>
-              <w:bottom w:val="single" w:color="808080" w:sz="4"/>
-              <w:right w:val="single" w:color="808080" w:sz="4"/>
-            </w:tcBorders>
-            <w:shd w:fill="D9E2F3" w:color="auto" w:val="clear"/>
-            <w:tcMar>
-              <w:top w:type="dxa" w:w="50"/>
-              <w:left w:type="dxa" w:w="90"/>
-              <w:bottom w:type="dxa" w:w="50"/>
-              <w:right w:type="dxa" w:w="90"/>
-            </w:tcMar>
-          </w:tcPr>
-          <w:p>
-            <w:pPr>
-              <w:spacing w:after="20"/>
-            </w:pPr>
-            <w:r>
-              <w:rPr>
-                <w:rFonts w:ascii="Times New Roman" w:cs="Times New Roman" w:eastAsia="Times New Roman" w:hAnsi="Times New Roman"/>
-                <w:b/>
-                <w:bCs/>
-                <w:sz w:val="18"/>
-                <w:szCs w:val="18"/>
-              </w:rPr>
-              <w:t xml:space="preserve">Report section</w:t>
-            </w:r>
-          </w:p>
-        </w:tc>
-        <w:tc>
-          <w:tcPr>
-            <w:tcW w:type="dxa" w:w="1589"/>
-            <w:tcBorders>
-              <w:top w:val="single" w:color="808080" w:sz="4"/>
-              <w:left w:val="single" w:color="808080" w:sz="4"/>
-              <w:bottom w:val="single" w:color="808080" w:sz="4"/>
-              <w:right w:val="single" w:color="808080" w:sz="4"/>
-            </w:tcBorders>
-            <w:shd w:fill="D9E2F3" w:color="auto" w:val="clear"/>
-            <w:tcMar>
-              <w:top w:type="dxa" w:w="50"/>
-              <w:left w:type="dxa" w:w="90"/>
-              <w:bottom w:type="dxa" w:w="50"/>
-              <w:right w:type="dxa" w:w="90"/>
-            </w:tcMar>
-          </w:tcPr>
-          <w:p>
-            <w:pPr>
-              <w:spacing w:after="20"/>
-            </w:pPr>
-            <w:r>
-              <w:rPr>
-                <w:rFonts w:ascii="Times New Roman" w:cs="Times New Roman" w:eastAsia="Times New Roman" w:hAnsi="Times New Roman"/>
-                <w:b/>
-                <w:bCs/>
-                <w:sz w:val="18"/>
-                <w:szCs w:val="18"/>
-              </w:rPr>
-              <w:t xml:space="preserve">Our rating</w:t>
-            </w:r>
-          </w:p>
-        </w:tc>
-        <w:tc>
-          <w:tcPr>
-            <w:tcW w:type="dxa" w:w="3307"/>
-            <w:tcBorders>
-              <w:top w:val="single" w:color="808080" w:sz="4"/>
-              <w:left w:val="single" w:color="808080" w:sz="4"/>
-              <w:bottom w:val="single" w:color="808080" w:sz="4"/>
-              <w:right w:val="single" w:color="808080" w:sz="4"/>
-            </w:tcBorders>
-            <w:shd w:fill="D9E2F3" w:color="auto" w:val="clear"/>
-            <w:tcMar>
-              <w:top w:type="dxa" w:w="50"/>
-              <w:left w:type="dxa" w:w="90"/>
-              <w:bottom w:type="dxa" w:w="50"/>
-              <w:right w:type="dxa" w:w="90"/>
-            </w:tcMar>
-          </w:tcPr>
-          <w:p>
-            <w:pPr>
-              <w:spacing w:after="20"/>
-            </w:pPr>
-            <w:r>
-              <w:rPr>
-                <w:rFonts w:ascii="Times New Roman" w:cs="Times New Roman" w:eastAsia="Times New Roman" w:hAnsi="Times New Roman"/>
-                <w:b/>
-                <w:bCs/>
-                <w:sz w:val="18"/>
-                <w:szCs w:val="18"/>
-              </w:rPr>
-              <w:t xml:space="preserve">If below good: what is missing</w:t>
-            </w:r>
-          </w:p>
-        </w:tc>
-        <w:tc>
-          <w:tcPr>
-            <w:tcW w:type="dxa" w:w="1104"/>
-            <w:tcBorders>
-              <w:top w:val="single" w:color="808080" w:sz="4"/>
-              <w:left w:val="single" w:color="808080" w:sz="4"/>
-              <w:bottom w:val="single" w:color="808080" w:sz="4"/>
-              <w:right w:val="single" w:color="808080" w:sz="4"/>
-            </w:tcBorders>
-            <w:shd w:fill="D9E2F3" w:color="auto" w:val="clear"/>
-            <w:tcMar>
-              <w:top w:type="dxa" w:w="50"/>
-              <w:left w:type="dxa" w:w="90"/>
-              <w:bottom w:type="dxa" w:w="50"/>
-              <w:right w:type="dxa" w:w="90"/>
-            </w:tcMar>
-          </w:tcPr>
-          <w:p>
-            <w:pPr>
-              <w:spacing w:after="20"/>
-            </w:pPr>
-            <w:r>
-              <w:rPr>
-                <w:rFonts w:ascii="Times New Roman" w:cs="Times New Roman" w:eastAsia="Times New Roman" w:hAnsi="Times New Roman"/>
-                <w:b/>
-                <w:bCs/>
-                <w:sz w:val="18"/>
-                <w:szCs w:val="18"/>
-              </w:rPr>
-              <w:t xml:space="preserve">Owner</w:t>
-            </w:r>
-          </w:p>
-        </w:tc>
-        <w:tc>
-          <w:tcPr>
-            <w:tcW w:type="dxa" w:w="1347"/>
-            <w:tcBorders>
-              <w:top w:val="single" w:color="808080" w:sz="4"/>
-              <w:left w:val="single" w:color="808080" w:sz="4"/>
-              <w:bottom w:val="single" w:color="808080" w:sz="4"/>
-              <w:right w:val="single" w:color="808080" w:sz="4"/>
-            </w:tcBorders>
-            <w:shd w:fill="D9E2F3" w:color="auto" w:val="clear"/>
-            <w:tcMar>
-              <w:top w:type="dxa" w:w="50"/>
-              <w:left w:type="dxa" w:w="90"/>
-              <w:bottom w:type="dxa" w:w="50"/>
-              <w:right w:type="dxa" w:w="90"/>
-            </w:tcMar>
-          </w:tcPr>
-          <w:p>
-            <w:pPr>
-              <w:spacing w:after="20"/>
-            </w:pPr>
-            <w:r>
-              <w:rPr>
-                <w:rFonts w:ascii="Times New Roman" w:cs="Times New Roman" w:eastAsia="Times New Roman" w:hAnsi="Times New Roman"/>
-                <w:b/>
-                <w:bCs/>
-                <w:sz w:val="18"/>
-                <w:szCs w:val="18"/>
-              </w:rPr>
-              <w:t xml:space="preserve">Lands by</w:t>
-            </w:r>
-          </w:p>
-        </w:tc>
-      </w:tr>
-      <w:tr>
-        <w:trPr>
-          <w:cantSplit/>
-        </w:trPr>
-        <w:tc>
-          <w:tcPr>
-            <w:tcW w:type="dxa" w:w="2013"/>
-            <w:tcBorders>
-              <w:top w:val="single" w:color="808080" w:sz="4"/>
-              <w:left w:val="single" w:color="808080" w:sz="4"/>
-              <w:bottom w:val="single" w:color="808080" w:sz="4"/>
-              <w:right w:val="single" w:color="808080" w:sz="4"/>
-            </w:tcBorders>
-            <w:tcMar>
-              <w:top w:type="dxa" w:w="50"/>
-              <w:left w:type="dxa" w:w="90"/>
-              <w:bottom w:type="dxa" w:w="50"/>
-              <w:right w:type="dxa" w:w="90"/>
-            </w:tcMar>
-          </w:tcPr>
-          <w:p>
-            <w:pPr>
-              <w:spacing w:after="20"/>
-            </w:pPr>
-            <w:r>
-              <w:rPr>
-                <w:rFonts w:ascii="Times New Roman" w:cs="Times New Roman" w:eastAsia="Times New Roman" w:hAnsi="Times New Roman"/>
-                <w:sz w:val="18"/>
-                <w:szCs w:val="18"/>
-              </w:rPr>
-              <w:t xml:space="preserve">1.1 to 1.5</w:t>
-            </w:r>
-          </w:p>
-        </w:tc>
-        <w:tc>
-          <w:tcPr>
-            <w:tcW w:type="dxa" w:w="1589"/>
-            <w:tcBorders>
-              <w:top w:val="single" w:color="808080" w:sz="4"/>
-              <w:left w:val="single" w:color="808080" w:sz="4"/>
-              <w:bottom w:val="single" w:color="808080" w:sz="4"/>
-              <w:right w:val="single" w:color="808080" w:sz="4"/>
-            </w:tcBorders>
-            <w:tcMar>
-              <w:top w:type="dxa" w:w="50"/>
-              <w:left w:type="dxa" w:w="90"/>
-              <w:bottom w:type="dxa" w:w="50"/>
-              <w:right w:type="dxa" w:w="90"/>
-            </w:tcMar>
-          </w:tcPr>
-          <w:p>
-            <w:pPr>
-              <w:spacing w:after="20"/>
-            </w:pPr>
-            <w:r>
-              <w:rPr>
-                <w:rFonts w:ascii="Times New Roman" w:cs="Times New Roman" w:eastAsia="Times New Roman" w:hAnsi="Times New Roman"/>
-                <w:sz w:val="18"/>
-                <w:szCs w:val="18"/>
-              </w:rPr>
-              <w:t xml:space="preserve">[ ]</w:t>
-            </w:r>
-          </w:p>
-        </w:tc>
-        <w:tc>
-          <w:tcPr>
-            <w:tcW w:type="dxa" w:w="3307"/>
-            <w:tcBorders>
-              <w:top w:val="single" w:color="808080" w:sz="4"/>
-              <w:left w:val="single" w:color="808080" w:sz="4"/>
-              <w:bottom w:val="single" w:color="808080" w:sz="4"/>
-              <w:right w:val="single" w:color="808080" w:sz="4"/>
-            </w:tcBorders>
-            <w:tcMar>
-              <w:top w:type="dxa" w:w="50"/>
-              <w:left w:type="dxa" w:w="90"/>
-              <w:bottom w:type="dxa" w:w="50"/>
-              <w:right w:type="dxa" w:w="90"/>
-            </w:tcMar>
-          </w:tcPr>
-          <w:p>
-            <w:pPr>
-              <w:spacing w:after="20"/>
-            </w:pPr>
-            <w:r>
-              <w:rPr>
-                <w:rFonts w:ascii="Times New Roman" w:cs="Times New Roman" w:eastAsia="Times New Roman" w:hAnsi="Times New Roman"/>
-                <w:sz w:val="18"/>
-                <w:szCs w:val="18"/>
-              </w:rPr>
-              <w:t xml:space="preserve">[ ]</w:t>
-            </w:r>
-          </w:p>
-        </w:tc>
-        <w:tc>
-          <w:tcPr>
-            <w:tcW w:type="dxa" w:w="1104"/>
-            <w:tcBorders>
-              <w:top w:val="single" w:color="808080" w:sz="4"/>
-              <w:left w:val="single" w:color="808080" w:sz="4"/>
-              <w:bottom w:val="single" w:color="808080" w:sz="4"/>
-              <w:right w:val="single" w:color="808080" w:sz="4"/>
-            </w:tcBorders>
-            <w:tcMar>
-              <w:top w:type="dxa" w:w="50"/>
-              <w:left w:type="dxa" w:w="90"/>
-              <w:bottom w:type="dxa" w:w="50"/>
-              <w:right w:type="dxa" w:w="90"/>
-            </w:tcMar>
-          </w:tcPr>
-          <w:p>
-            <w:pPr>
-              <w:spacing w:after="20"/>
-            </w:pPr>
-            <w:r>
-              <w:rPr>
-                <w:rFonts w:ascii="Times New Roman" w:cs="Times New Roman" w:eastAsia="Times New Roman" w:hAnsi="Times New Roman"/>
-                <w:sz w:val="18"/>
-                <w:szCs w:val="18"/>
-              </w:rPr>
-              <w:t xml:space="preserve">[ ]</w:t>
-            </w:r>
-          </w:p>
-        </w:tc>
-        <w:tc>
-          <w:tcPr>
-            <w:tcW w:type="dxa" w:w="1347"/>
-            <w:tcBorders>
-              <w:top w:val="single" w:color="808080" w:sz="4"/>
-              <w:left w:val="single" w:color="808080" w:sz="4"/>
-              <w:bottom w:val="single" w:color="808080" w:sz="4"/>
-              <w:right w:val="single" w:color="808080" w:sz="4"/>
-            </w:tcBorders>
-            <w:tcMar>
-              <w:top w:type="dxa" w:w="50"/>
-              <w:left w:type="dxa" w:w="90"/>
-              <w:bottom w:type="dxa" w:w="50"/>
-              <w:right w:type="dxa" w:w="90"/>
-            </w:tcMar>
-          </w:tcPr>
-          <w:p>
-            <w:pPr>
-              <w:spacing w:after="20"/>
-            </w:pPr>
-            <w:r>
-              <w:rPr>
-                <w:rFonts w:ascii="Times New Roman" w:cs="Times New Roman" w:eastAsia="Times New Roman" w:hAnsi="Times New Roman"/>
-                <w:sz w:val="18"/>
-                <w:szCs w:val="18"/>
-              </w:rPr>
-              <w:t xml:space="preserve">[ ]</w:t>
-            </w:r>
-          </w:p>
-        </w:tc>
-      </w:tr>
-      <w:tr>
-        <w:trPr>
-          <w:cantSplit/>
-        </w:trPr>
-        <w:tc>
-          <w:tcPr>
-            <w:tcW w:type="dxa" w:w="2013"/>
-            <w:tcBorders>
-              <w:top w:val="single" w:color="808080" w:sz="4"/>
-              <w:left w:val="single" w:color="808080" w:sz="4"/>
-              <w:bottom w:val="single" w:color="808080" w:sz="4"/>
-              <w:right w:val="single" w:color="808080" w:sz="4"/>
-            </w:tcBorders>
-            <w:tcMar>
-              <w:top w:type="dxa" w:w="50"/>
-              <w:left w:type="dxa" w:w="90"/>
-              <w:bottom w:type="dxa" w:w="50"/>
-              <w:right w:type="dxa" w:w="90"/>
-            </w:tcMar>
-          </w:tcPr>
-          <w:p>
-            <w:pPr>
-              <w:spacing w:after="20"/>
-            </w:pPr>
-            <w:r>
-              <w:rPr>
-                <w:rFonts w:ascii="Times New Roman" w:cs="Times New Roman" w:eastAsia="Times New Roman" w:hAnsi="Times New Roman"/>
-                <w:sz w:val="18"/>
-                <w:szCs w:val="18"/>
-              </w:rPr>
-              <w:t xml:space="preserve">2.1</w:t>
-            </w:r>
-          </w:p>
-        </w:tc>
-        <w:tc>
-          <w:tcPr>
-            <w:tcW w:type="dxa" w:w="1589"/>
-            <w:tcBorders>
-              <w:top w:val="single" w:color="808080" w:sz="4"/>
-              <w:left w:val="single" w:color="808080" w:sz="4"/>
-              <w:bottom w:val="single" w:color="808080" w:sz="4"/>
-              <w:right w:val="single" w:color="808080" w:sz="4"/>
-            </w:tcBorders>
-            <w:tcMar>
-              <w:top w:type="dxa" w:w="50"/>
-              <w:left w:type="dxa" w:w="90"/>
-              <w:bottom w:type="dxa" w:w="50"/>
-              <w:right w:type="dxa" w:w="90"/>
-            </w:tcMar>
-          </w:tcPr>
-          <w:p>
-            <w:pPr>
-              <w:spacing w:after="20"/>
-            </w:pPr>
-            <w:r>
-              <w:rPr>
-                <w:rFonts w:ascii="Times New Roman" w:cs="Times New Roman" w:eastAsia="Times New Roman" w:hAnsi="Times New Roman"/>
-                <w:sz w:val="18"/>
-                <w:szCs w:val="18"/>
-              </w:rPr>
-              <w:t xml:space="preserve">[ ]</w:t>
-            </w:r>
-          </w:p>
-        </w:tc>
-        <w:tc>
-          <w:tcPr>
-            <w:tcW w:type="dxa" w:w="3307"/>
-            <w:tcBorders>
-              <w:top w:val="single" w:color="808080" w:sz="4"/>
-              <w:left w:val="single" w:color="808080" w:sz="4"/>
-              <w:bottom w:val="single" w:color="808080" w:sz="4"/>
-              <w:right w:val="single" w:color="808080" w:sz="4"/>
-            </w:tcBorders>
-            <w:tcMar>
-              <w:top w:type="dxa" w:w="50"/>
-              <w:left w:type="dxa" w:w="90"/>
-              <w:bottom w:type="dxa" w:w="50"/>
-              <w:right w:type="dxa" w:w="90"/>
-            </w:tcMar>
-          </w:tcPr>
-          <w:p>
-            <w:pPr>
-              <w:spacing w:after="20"/>
-            </w:pPr>
-            <w:r>
-              <w:rPr>
-                <w:rFonts w:ascii="Times New Roman" w:cs="Times New Roman" w:eastAsia="Times New Roman" w:hAnsi="Times New Roman"/>
-                <w:sz w:val="18"/>
-                <w:szCs w:val="18"/>
-              </w:rPr>
-              <w:t xml:space="preserve">[ ]</w:t>
-            </w:r>
-          </w:p>
-        </w:tc>
-        <w:tc>
-          <w:tcPr>
-            <w:tcW w:type="dxa" w:w="1104"/>
-            <w:tcBorders>
-              <w:top w:val="single" w:color="808080" w:sz="4"/>
-              <w:left w:val="single" w:color="808080" w:sz="4"/>
-              <w:bottom w:val="single" w:color="808080" w:sz="4"/>
-              <w:right w:val="single" w:color="808080" w:sz="4"/>
-            </w:tcBorders>
-            <w:tcMar>
-              <w:top w:type="dxa" w:w="50"/>
-              <w:left w:type="dxa" w:w="90"/>
-              <w:bottom w:type="dxa" w:w="50"/>
-              <w:right w:type="dxa" w:w="90"/>
-            </w:tcMar>
-          </w:tcPr>
-          <w:p>
-            <w:pPr>
-              <w:spacing w:after="20"/>
-            </w:pPr>
-            <w:r>
-              <w:rPr>
-                <w:rFonts w:ascii="Times New Roman" w:cs="Times New Roman" w:eastAsia="Times New Roman" w:hAnsi="Times New Roman"/>
-                <w:sz w:val="18"/>
-                <w:szCs w:val="18"/>
-              </w:rPr>
-              <w:t xml:space="preserve">[ ]</w:t>
-            </w:r>
-          </w:p>
-        </w:tc>
-        <w:tc>
-          <w:tcPr>
-            <w:tcW w:type="dxa" w:w="1347"/>
-            <w:tcBorders>
-              <w:top w:val="single" w:color="808080" w:sz="4"/>
-              <w:left w:val="single" w:color="808080" w:sz="4"/>
-              <w:bottom w:val="single" w:color="808080" w:sz="4"/>
-              <w:right w:val="single" w:color="808080" w:sz="4"/>
-            </w:tcBorders>
-            <w:tcMar>
-              <w:top w:type="dxa" w:w="50"/>
-              <w:left w:type="dxa" w:w="90"/>
-              <w:bottom w:type="dxa" w:w="50"/>
-              <w:right w:type="dxa" w:w="90"/>
-            </w:tcMar>
-          </w:tcPr>
-          <w:p>
-            <w:pPr>
-              <w:spacing w:after="20"/>
-            </w:pPr>
-            <w:r>
-              <w:rPr>
-                <w:rFonts w:ascii="Times New Roman" w:cs="Times New Roman" w:eastAsia="Times New Roman" w:hAnsi="Times New Roman"/>
-                <w:sz w:val="18"/>
-                <w:szCs w:val="18"/>
-              </w:rPr>
-              <w:t xml:space="preserve">[ ]</w:t>
-            </w:r>
-          </w:p>
-        </w:tc>
-      </w:tr>
-      <w:tr>
-        <w:trPr>
-          <w:cantSplit/>
-        </w:trPr>
-        <w:tc>
-          <w:tcPr>
-            <w:tcW w:type="dxa" w:w="2013"/>
-            <w:tcBorders>
-              <w:top w:val="single" w:color="808080" w:sz="4"/>
-              <w:left w:val="single" w:color="808080" w:sz="4"/>
-              <w:bottom w:val="single" w:color="808080" w:sz="4"/>
-              <w:right w:val="single" w:color="808080" w:sz="4"/>
-            </w:tcBorders>
-            <w:tcMar>
-              <w:top w:type="dxa" w:w="50"/>
-              <w:left w:type="dxa" w:w="90"/>
-              <w:bottom w:type="dxa" w:w="50"/>
-              <w:right w:type="dxa" w:w="90"/>
-            </w:tcMar>
-          </w:tcPr>
-          <w:p>
-            <w:pPr>
-              <w:spacing w:after="20"/>
-            </w:pPr>
-            <w:r>
-              <w:rPr>
-                <w:rFonts w:ascii="Times New Roman" w:cs="Times New Roman" w:eastAsia="Times New Roman" w:hAnsi="Times New Roman"/>
-                <w:sz w:val="18"/>
-                <w:szCs w:val="18"/>
-              </w:rPr>
-              <w:t xml:space="preserve">2.2</w:t>
-            </w:r>
-          </w:p>
-        </w:tc>
-        <w:tc>
-          <w:tcPr>
-            <w:tcW w:type="dxa" w:w="1589"/>
-            <w:tcBorders>
-              <w:top w:val="single" w:color="808080" w:sz="4"/>
-              <w:left w:val="single" w:color="808080" w:sz="4"/>
-              <w:bottom w:val="single" w:color="808080" w:sz="4"/>
-              <w:right w:val="single" w:color="808080" w:sz="4"/>
-            </w:tcBorders>
-            <w:tcMar>
-              <w:top w:type="dxa" w:w="50"/>
-              <w:left w:type="dxa" w:w="90"/>
-              <w:bottom w:type="dxa" w:w="50"/>
-              <w:right w:type="dxa" w:w="90"/>
-            </w:tcMar>
-          </w:tcPr>
-          <w:p>
-            <w:pPr>
-              <w:spacing w:after="20"/>
-            </w:pPr>
-            <w:r>
-              <w:rPr>
-                <w:rFonts w:ascii="Times New Roman" w:cs="Times New Roman" w:eastAsia="Times New Roman" w:hAnsi="Times New Roman"/>
-                <w:sz w:val="18"/>
-                <w:szCs w:val="18"/>
-              </w:rPr>
-              <w:t xml:space="preserve">[ ]</w:t>
-            </w:r>
-          </w:p>
-        </w:tc>
-        <w:tc>
-          <w:tcPr>
-            <w:tcW w:type="dxa" w:w="3307"/>
-            <w:tcBorders>
-              <w:top w:val="single" w:color="808080" w:sz="4"/>
-              <w:left w:val="single" w:color="808080" w:sz="4"/>
-              <w:bottom w:val="single" w:color="808080" w:sz="4"/>
-              <w:right w:val="single" w:color="808080" w:sz="4"/>
-            </w:tcBorders>
-            <w:tcMar>
-              <w:top w:type="dxa" w:w="50"/>
-              <w:left w:type="dxa" w:w="90"/>
-              <w:bottom w:type="dxa" w:w="50"/>
-              <w:right w:type="dxa" w:w="90"/>
-            </w:tcMar>
-          </w:tcPr>
-          <w:p>
-            <w:pPr>
-              <w:spacing w:after="20"/>
-            </w:pPr>
-            <w:r>
-              <w:rPr>
-                <w:rFonts w:ascii="Times New Roman" w:cs="Times New Roman" w:eastAsia="Times New Roman" w:hAnsi="Times New Roman"/>
-                <w:sz w:val="18"/>
-                <w:szCs w:val="18"/>
-              </w:rPr>
-              <w:t xml:space="preserve">[ ]</w:t>
-            </w:r>
-          </w:p>
-        </w:tc>
-        <w:tc>
-          <w:tcPr>
-            <w:tcW w:type="dxa" w:w="1104"/>
-            <w:tcBorders>
-              <w:top w:val="single" w:color="808080" w:sz="4"/>
-              <w:left w:val="single" w:color="808080" w:sz="4"/>
-              <w:bottom w:val="single" w:color="808080" w:sz="4"/>
-              <w:right w:val="single" w:color="808080" w:sz="4"/>
-            </w:tcBorders>
-            <w:tcMar>
-              <w:top w:type="dxa" w:w="50"/>
-              <w:left w:type="dxa" w:w="90"/>
-              <w:bottom w:type="dxa" w:w="50"/>
-              <w:right w:type="dxa" w:w="90"/>
-            </w:tcMar>
-          </w:tcPr>
-          <w:p>
-            <w:pPr>
-              <w:spacing w:after="20"/>
-            </w:pPr>
-            <w:r>
-              <w:rPr>
-                <w:rFonts w:ascii="Times New Roman" w:cs="Times New Roman" w:eastAsia="Times New Roman" w:hAnsi="Times New Roman"/>
-                <w:sz w:val="18"/>
-                <w:szCs w:val="18"/>
-              </w:rPr>
-              <w:t xml:space="preserve">[ ]</w:t>
-            </w:r>
-          </w:p>
-        </w:tc>
-        <w:tc>
-          <w:tcPr>
-            <w:tcW w:type="dxa" w:w="1347"/>
-            <w:tcBorders>
-              <w:top w:val="single" w:color="808080" w:sz="4"/>
-              <w:left w:val="single" w:color="808080" w:sz="4"/>
-              <w:bottom w:val="single" w:color="808080" w:sz="4"/>
-              <w:right w:val="single" w:color="808080" w:sz="4"/>
-            </w:tcBorders>
-            <w:tcMar>
-              <w:top w:type="dxa" w:w="50"/>
-              <w:left w:type="dxa" w:w="90"/>
-              <w:bottom w:type="dxa" w:w="50"/>
-              <w:right w:type="dxa" w:w="90"/>
-            </w:tcMar>
-          </w:tcPr>
-          <w:p>
-            <w:pPr>
-              <w:spacing w:after="20"/>
-            </w:pPr>
-            <w:r>
-              <w:rPr>
-                <w:rFonts w:ascii="Times New Roman" w:cs="Times New Roman" w:eastAsia="Times New Roman" w:hAnsi="Times New Roman"/>
-                <w:sz w:val="18"/>
-                <w:szCs w:val="18"/>
-              </w:rPr>
-              <w:t xml:space="preserve">[ ]</w:t>
-            </w:r>
-          </w:p>
-        </w:tc>
-      </w:tr>
-      <w:tr>
-        <w:trPr>
-          <w:cantSplit/>
-        </w:trPr>
-        <w:tc>
-          <w:tcPr>
-            <w:tcW w:type="dxa" w:w="2013"/>
-            <w:tcBorders>
-              <w:top w:val="single" w:color="808080" w:sz="4"/>
-              <w:left w:val="single" w:color="808080" w:sz="4"/>
-              <w:bottom w:val="single" w:color="808080" w:sz="4"/>
-              <w:right w:val="single" w:color="808080" w:sz="4"/>
-            </w:tcBorders>
-            <w:tcMar>
-              <w:top w:type="dxa" w:w="50"/>
-              <w:left w:type="dxa" w:w="90"/>
-              <w:bottom w:type="dxa" w:w="50"/>
-              <w:right w:type="dxa" w:w="90"/>
-            </w:tcMar>
-          </w:tcPr>
-          <w:p>
-            <w:pPr>
-              <w:spacing w:after="20"/>
-            </w:pPr>
-            <w:r>
-              <w:rPr>
-                <w:rFonts w:ascii="Times New Roman" w:cs="Times New Roman" w:eastAsia="Times New Roman" w:hAnsi="Times New Roman"/>
-                <w:sz w:val="18"/>
-                <w:szCs w:val="18"/>
-              </w:rPr>
-              <w:t xml:space="preserve">2.3</w:t>
-            </w:r>
-          </w:p>
-        </w:tc>
-        <w:tc>
-          <w:tcPr>
-            <w:tcW w:type="dxa" w:w="1589"/>
-            <w:tcBorders>
-              <w:top w:val="single" w:color="808080" w:sz="4"/>
-              <w:left w:val="single" w:color="808080" w:sz="4"/>
-              <w:bottom w:val="single" w:color="808080" w:sz="4"/>
-              <w:right w:val="single" w:color="808080" w:sz="4"/>
-            </w:tcBorders>
-            <w:tcMar>
-              <w:top w:type="dxa" w:w="50"/>
-              <w:left w:type="dxa" w:w="90"/>
-              <w:bottom w:type="dxa" w:w="50"/>
-              <w:right w:type="dxa" w:w="90"/>
-            </w:tcMar>
-          </w:tcPr>
-          <w:p>
-            <w:pPr>
-              <w:spacing w:after="20"/>
-            </w:pPr>
-            <w:r>
-              <w:rPr>
-                <w:rFonts w:ascii="Times New Roman" w:cs="Times New Roman" w:eastAsia="Times New Roman" w:hAnsi="Times New Roman"/>
-                <w:sz w:val="18"/>
-                <w:szCs w:val="18"/>
-              </w:rPr>
-              <w:t xml:space="preserve">[ ]</w:t>
-            </w:r>
-          </w:p>
-        </w:tc>
-        <w:tc>
-          <w:tcPr>
-            <w:tcW w:type="dxa" w:w="3307"/>
-            <w:tcBorders>
-              <w:top w:val="single" w:color="808080" w:sz="4"/>
-              <w:left w:val="single" w:color="808080" w:sz="4"/>
-              <w:bottom w:val="single" w:color="808080" w:sz="4"/>
-              <w:right w:val="single" w:color="808080" w:sz="4"/>
-            </w:tcBorders>
-            <w:tcMar>
-              <w:top w:type="dxa" w:w="50"/>
-              <w:left w:type="dxa" w:w="90"/>
-              <w:bottom w:type="dxa" w:w="50"/>
-              <w:right w:type="dxa" w:w="90"/>
-            </w:tcMar>
-          </w:tcPr>
-          <w:p>
-            <w:pPr>
-              <w:spacing w:after="20"/>
-            </w:pPr>
-            <w:r>
-              <w:rPr>
-                <w:rFonts w:ascii="Times New Roman" w:cs="Times New Roman" w:eastAsia="Times New Roman" w:hAnsi="Times New Roman"/>
-                <w:sz w:val="18"/>
-                <w:szCs w:val="18"/>
-              </w:rPr>
-              <w:t xml:space="preserve">[ ]</w:t>
-            </w:r>
-          </w:p>
-        </w:tc>
-        <w:tc>
-          <w:tcPr>
-            <w:tcW w:type="dxa" w:w="1104"/>
-            <w:tcBorders>
-              <w:top w:val="single" w:color="808080" w:sz="4"/>
-              <w:left w:val="single" w:color="808080" w:sz="4"/>
-              <w:bottom w:val="single" w:color="808080" w:sz="4"/>
-              <w:right w:val="single" w:color="808080" w:sz="4"/>
-            </w:tcBorders>
-            <w:tcMar>
-              <w:top w:type="dxa" w:w="50"/>
-              <w:left w:type="dxa" w:w="90"/>
-              <w:bottom w:type="dxa" w:w="50"/>
-              <w:right w:type="dxa" w:w="90"/>
-            </w:tcMar>
-          </w:tcPr>
-          <w:p>
-            <w:pPr>
-              <w:spacing w:after="20"/>
-            </w:pPr>
-            <w:r>
-              <w:rPr>
-                <w:rFonts w:ascii="Times New Roman" w:cs="Times New Roman" w:eastAsia="Times New Roman" w:hAnsi="Times New Roman"/>
-                <w:sz w:val="18"/>
-                <w:szCs w:val="18"/>
-              </w:rPr>
-              <w:t xml:space="preserve">[ ]</w:t>
-            </w:r>
-          </w:p>
-        </w:tc>
-        <w:tc>
-          <w:tcPr>
-            <w:tcW w:type="dxa" w:w="1347"/>
-            <w:tcBorders>
-              <w:top w:val="single" w:color="808080" w:sz="4"/>
-              <w:left w:val="single" w:color="808080" w:sz="4"/>
-              <w:bottom w:val="single" w:color="808080" w:sz="4"/>
-              <w:right w:val="single" w:color="808080" w:sz="4"/>
-            </w:tcBorders>
-            <w:tcMar>
-              <w:top w:type="dxa" w:w="50"/>
-              <w:left w:type="dxa" w:w="90"/>
-              <w:bottom w:type="dxa" w:w="50"/>
-              <w:right w:type="dxa" w:w="90"/>
-            </w:tcMar>
-          </w:tcPr>
-          <w:p>
-            <w:pPr>
-              <w:spacing w:after="20"/>
-            </w:pPr>
-            <w:r>
-              <w:rPr>
-                <w:rFonts w:ascii="Times New Roman" w:cs="Times New Roman" w:eastAsia="Times New Roman" w:hAnsi="Times New Roman"/>
-                <w:sz w:val="18"/>
-                <w:szCs w:val="18"/>
-              </w:rPr>
-              <w:t xml:space="preserve">[ ]</w:t>
-            </w:r>
-          </w:p>
-        </w:tc>
-      </w:tr>
-      <w:tr>
-        <w:trPr>
-          <w:cantSplit/>
-        </w:trPr>
-        <w:tc>
-          <w:tcPr>
-            <w:tcW w:type="dxa" w:w="2013"/>
-            <w:tcBorders>
-              <w:top w:val="single" w:color="808080" w:sz="4"/>
-              <w:left w:val="single" w:color="808080" w:sz="4"/>
-              <w:bottom w:val="single" w:color="808080" w:sz="4"/>
-              <w:right w:val="single" w:color="808080" w:sz="4"/>
-            </w:tcBorders>
-            <w:tcMar>
-              <w:top w:type="dxa" w:w="50"/>
-              <w:left w:type="dxa" w:w="90"/>
-              <w:bottom w:type="dxa" w:w="50"/>
-              <w:right w:type="dxa" w:w="90"/>
-            </w:tcMar>
-          </w:tcPr>
-          <w:p>
-            <w:pPr>
-              <w:spacing w:after="20"/>
-            </w:pPr>
-            <w:r>
-              <w:rPr>
-                <w:rFonts w:ascii="Times New Roman" w:cs="Times New Roman" w:eastAsia="Times New Roman" w:hAnsi="Times New Roman"/>
-                <w:sz w:val="18"/>
-                <w:szCs w:val="18"/>
-              </w:rPr>
-              <w:t xml:space="preserve">2.4</w:t>
-            </w:r>
-          </w:p>
-        </w:tc>
-        <w:tc>
-          <w:tcPr>
-            <w:tcW w:type="dxa" w:w="1589"/>
-            <w:tcBorders>
-              <w:top w:val="single" w:color="808080" w:sz="4"/>
-              <w:left w:val="single" w:color="808080" w:sz="4"/>
-              <w:bottom w:val="single" w:color="808080" w:sz="4"/>
-              <w:right w:val="single" w:color="808080" w:sz="4"/>
-            </w:tcBorders>
-            <w:tcMar>
-              <w:top w:type="dxa" w:w="50"/>
-              <w:left w:type="dxa" w:w="90"/>
-              <w:bottom w:type="dxa" w:w="50"/>
-              <w:right w:type="dxa" w:w="90"/>
-            </w:tcMar>
-          </w:tcPr>
-          <w:p>
-            <w:pPr>
-              <w:spacing w:after="20"/>
-            </w:pPr>
-            <w:r>
-              <w:rPr>
-                <w:rFonts w:ascii="Times New Roman" w:cs="Times New Roman" w:eastAsia="Times New Roman" w:hAnsi="Times New Roman"/>
-                <w:sz w:val="18"/>
-                <w:szCs w:val="18"/>
-              </w:rPr>
-              <w:t xml:space="preserve">[ ]</w:t>
-            </w:r>
-          </w:p>
-        </w:tc>
-        <w:tc>
-          <w:tcPr>
-            <w:tcW w:type="dxa" w:w="3307"/>
-            <w:tcBorders>
-              <w:top w:val="single" w:color="808080" w:sz="4"/>
-              <w:left w:val="single" w:color="808080" w:sz="4"/>
-              <w:bottom w:val="single" w:color="808080" w:sz="4"/>
-              <w:right w:val="single" w:color="808080" w:sz="4"/>
-            </w:tcBorders>
-            <w:tcMar>
-              <w:top w:type="dxa" w:w="50"/>
-              <w:left w:type="dxa" w:w="90"/>
-              <w:bottom w:type="dxa" w:w="50"/>
-              <w:right w:type="dxa" w:w="90"/>
-            </w:tcMar>
-          </w:tcPr>
-          <w:p>
-            <w:pPr>
-              <w:spacing w:after="20"/>
-            </w:pPr>
-            <w:r>
-              <w:rPr>
-                <w:rFonts w:ascii="Times New Roman" w:cs="Times New Roman" w:eastAsia="Times New Roman" w:hAnsi="Times New Roman"/>
-                <w:sz w:val="18"/>
-                <w:szCs w:val="18"/>
-              </w:rPr>
-              <w:t xml:space="preserve">[ ]</w:t>
-            </w:r>
-          </w:p>
-        </w:tc>
-        <w:tc>
-          <w:tcPr>
-            <w:tcW w:type="dxa" w:w="1104"/>
-            <w:tcBorders>
-              <w:top w:val="single" w:color="808080" w:sz="4"/>
-              <w:left w:val="single" w:color="808080" w:sz="4"/>
-              <w:bottom w:val="single" w:color="808080" w:sz="4"/>
-              <w:right w:val="single" w:color="808080" w:sz="4"/>
-            </w:tcBorders>
-            <w:tcMar>
-              <w:top w:type="dxa" w:w="50"/>
-              <w:left w:type="dxa" w:w="90"/>
-              <w:bottom w:type="dxa" w:w="50"/>
-              <w:right w:type="dxa" w:w="90"/>
-            </w:tcMar>
-          </w:tcPr>
-          <w:p>
-            <w:pPr>
-              <w:spacing w:after="20"/>
-            </w:pPr>
-            <w:r>
-              <w:rPr>
-                <w:rFonts w:ascii="Times New Roman" w:cs="Times New Roman" w:eastAsia="Times New Roman" w:hAnsi="Times New Roman"/>
-                <w:sz w:val="18"/>
-                <w:szCs w:val="18"/>
-              </w:rPr>
-              <w:t xml:space="preserve">[ ]</w:t>
-            </w:r>
-          </w:p>
-        </w:tc>
-        <w:tc>
-          <w:tcPr>
-            <w:tcW w:type="dxa" w:w="1347"/>
-            <w:tcBorders>
-              <w:top w:val="single" w:color="808080" w:sz="4"/>
-              <w:left w:val="single" w:color="808080" w:sz="4"/>
-              <w:bottom w:val="single" w:color="808080" w:sz="4"/>
-              <w:right w:val="single" w:color="808080" w:sz="4"/>
-            </w:tcBorders>
-            <w:tcMar>
-              <w:top w:type="dxa" w:w="50"/>
-              <w:left w:type="dxa" w:w="90"/>
-              <w:bottom w:type="dxa" w:w="50"/>
-              <w:right w:type="dxa" w:w="90"/>
-            </w:tcMar>
-          </w:tcPr>
-          <w:p>
-            <w:pPr>
-              <w:spacing w:after="20"/>
-            </w:pPr>
-            <w:r>
-              <w:rPr>
-                <w:rFonts w:ascii="Times New Roman" w:cs="Times New Roman" w:eastAsia="Times New Roman" w:hAnsi="Times New Roman"/>
-                <w:sz w:val="18"/>
-                <w:szCs w:val="18"/>
-              </w:rPr>
-              <w:t xml:space="preserve">[ ]</w:t>
-            </w:r>
-          </w:p>
-        </w:tc>
-      </w:tr>
-    </w:tbl>
     <w:sectPr>
       <w:headerReference w:type="default" r:id="rId7"/>
       <w:footerReference w:type="default" r:id="rId8"/>

</xml_diff>

<commit_message>
DAT-45: restore four-candidate bake-offs for M1 through M4
Revise Workbook 1 so project models are selection experiments with
validation-locked winners, not pre-chosen architectures.
</commit_message>
<xml_diff>
--- a/docs/reports/T4.A4.docx
+++ b/docs/reports/T4.A4.docx
@@ -850,7 +850,7 @@
           <w:sz w:val="22"/>
           <w:szCs w:val="22"/>
         </w:rPr>
-        <w:t xml:space="preserve">The platform uses Yjs for convergent shared-document state [5], [6] and an event-sourced PostgreSQL control plane that enforces session roles, totally orders agent commands, and logs every action. That combination is what makes interruption and rollback possible across five fixed tools. Four learned components sit above the platform.</w:t>
+        <w:t>The platform uses Yjs for convergent shared-document state [5], [6] and an event-sourced PostgreSQL control plane that enforces session roles, totally orders agent commands, and logs every action. That combination is what makes interruption and rollback possible across five fixed tools. Four learned components sit above the platform. Each of M1 through M4 is developed through a task-specific four-candidate bake-off. Within a task, all four candidates use the same frozen data membership, preprocessing, evaluation harness, and repeated-run policy. The team selects one winner per task using validation results and task-specific guardrails; an independent teammate then reproduces one winning run from a clean checkout. Only the verified winner for each task is used for final held-out evaluation and integrated into the serving layer. M1 selects on validation ROUGE-L subject to a factual-state accuracy guardrail, with latency and cost as tie-breakers, and also reports ROUGE-1, ROUGE-2, and BERTScore-F1. M2 selects on validation macro-F1 with per-class reporting. M3 selects on validation macro-F1 subject to harmful-merge and escalation guardrails. M4 first gates candidates on valid DAG production and then selects using routing accuracy, completion, latency, and cost. Architectures named below are candidate families under evaluation, not final selections.</w:t>
       </w:r>
     </w:p>
     <w:tbl>
@@ -1098,7 +1098,7 @@
                 <w:sz w:val="18"/>
                 <w:szCs w:val="18"/>
               </w:rPr>
-              <w:t>Four-candidate bake-off: ModernBERT extractive selector [15], plus Qwen and Gemma LoRA adapters [16], [10]; winner selected by ROUGE-L</w:t>
+              <w:t>Four-candidate bake-off (extractive ModernBERT control; Qwen and Gemma LoRA generators); one winner selected on validation before held-out test</w:t>
             </w:r>
           </w:p>
         </w:tc>
@@ -1128,7 +1128,7 @@
                 <w:sz w:val="18"/>
                 <w:szCs w:val="18"/>
               </w:rPr>
-              <w:t xml:space="preserve">ROUGE-L at or above 28.2 on the QMSum held-out split, mean of three seeds with 95% CI, reported against the published QMSum BART result as a declared reference point</w:t>
+              <w:t>Validation ROUGE-L primary, with ROUGE-1/2 and BERTScore-F1; factual-state guardrail; held-out target ROUGE-L at or above 28.2 (mean of three seeds, 95% CI) as a QMSum reference floor</w:t>
             </w:r>
           </w:p>
         </w:tc>
@@ -1223,7 +1223,7 @@
                 <w:sz w:val="18"/>
                 <w:szCs w:val="18"/>
               </w:rPr>
-              <w:t xml:space="preserve">ModernBERT cross-encoder over the recent event window</w:t>
+              <w:t>Four-candidate bake-off (classical TF-IDF control; DeBERTa and ModernBERT cross-encoders; Qwen classification head); winner selected on validation</w:t>
             </w:r>
           </w:p>
         </w:tc>
@@ -1253,7 +1253,7 @@
                 <w:sz w:val="18"/>
                 <w:szCs w:val="18"/>
               </w:rPr>
-              <w:t xml:space="preserve">Macro-F1 of at least 0.75</w:t>
+              <w:t>Validation macro-F1 primary with per-class F1; held-out macro-F1 at or above 0.75 after winner lock</w:t>
             </w:r>
           </w:p>
         </w:tc>
@@ -1348,7 +1348,7 @@
                 <w:sz w:val="18"/>
                 <w:szCs w:val="18"/>
               </w:rPr>
-              <w:t xml:space="preserve">Cross-encoder with an abstention (escalate) option</w:t>
+              <w:t>Four-candidate bake-off (last-writer-wins control; ModernBERT pairwise; Qwen LoRA and few-shot Qwen); winner selected on validation</w:t>
             </w:r>
           </w:p>
         </w:tc>
@@ -1378,7 +1378,7 @@
                 <w:sz w:val="18"/>
                 <w:szCs w:val="18"/>
               </w:rPr>
-              <w:t xml:space="preserve">Macro-F1 of at least 0.70, and fewer harmful outcomes than last-writer-wins</w:t>
+              <w:t>Validation macro-F1 primary with harmful-merge and escalation guardrails; held-out macro-F1 at or above 0.70 and fewer harmful outcomes than last-writer-wins</w:t>
             </w:r>
           </w:p>
         </w:tc>
@@ -1473,7 +1473,7 @@
                 <w:sz w:val="18"/>
                 <w:szCs w:val="18"/>
               </w:rPr>
-              <w:t xml:space="preserve">LLM planner with a learned router</w:t>
+              <w:t>Four-candidate bake-off (rules-only control; Qwen or Gemma planner with learned router; single-prompt planner/router); winner selected on validation</w:t>
             </w:r>
           </w:p>
         </w:tc>
@@ -1503,7 +1503,7 @@
                 <w:sz w:val="18"/>
                 <w:szCs w:val="18"/>
               </w:rPr>
-              <w:t xml:space="preserve">Routing by skill, workload, and cost, compared with rules-only routing</w:t>
+              <w:t>DAG validity as a gate, then routing accuracy, completion, latency, and cost versus rules-only</w:t>
             </w:r>
           </w:p>
         </w:tc>
@@ -1522,7 +1522,7 @@
           <w:sz w:val="20"/>
           <w:szCs w:val="20"/>
         </w:rPr>
-        <w:t xml:space="preserve">Table 1. The four learned components and their success criteria.</w:t>
+        <w:t>Table 1. The four learned components, each developed as a four-candidate bake-off with a validation-locked winner.</w:t>
       </w:r>
     </w:p>
     <w:p>
@@ -3095,7 +3095,7 @@
                 <w:sz w:val="18"/>
                 <w:szCs w:val="18"/>
               </w:rPr>
-              <w:t xml:space="preserve">M1 produces a session-state catch-up summary for a participant joining in progress</w:t>
+              <w:t>M1 catch-up summarizer: evaluate four candidates and integrate the verified validation winner</w:t>
             </w:r>
           </w:p>
         </w:tc>
@@ -3125,7 +3125,7 @@
                 <w:sz w:val="18"/>
                 <w:szCs w:val="18"/>
               </w:rPr>
-              <w:t xml:space="preserve">ROUGE-L at or above 28.2 on the QMSum held-out split, mean of three seeds with 95% CI. The published QMSum BART Locator-plus-Summarizer result (ROUGE-1 31.74, ROUGE-2 8.53, ROUGE-L 28.21) [2] is cited as a declared reference point for scale, and is explicitly not reproduced by this project</w:t>
+              <w:t>Four candidates share frozen QMSum membership and harness; winner locked on validation ROUGE-L under a factuality guardrail; held-out ROUGE-L at or above 28.2 (mean of three seeds, 95% CI) reported against the published QMSum BART figure as a reference floor only</w:t>
             </w:r>
           </w:p>
         </w:tc>
@@ -3190,7 +3190,7 @@
                 <w:sz w:val="18"/>
                 <w:szCs w:val="18"/>
               </w:rPr>
-              <w:t xml:space="preserve">M2 identifies which participant an instruction addresses</w:t>
+              <w:t>M2 intent attribution: evaluate four candidates and integrate the verified validation winner</w:t>
             </w:r>
           </w:p>
         </w:tc>
@@ -3220,7 +3220,7 @@
                 <w:sz w:val="18"/>
                 <w:szCs w:val="18"/>
               </w:rPr>
-              <w:t xml:space="preserve">Macro-F1 of at least 0.75 on the held-out session-level test split, mean of three seeds with 95% CI</w:t>
+              <w:t>Four candidates share frozen session-level splits and harness; winner locked on validation macro-F1 with per-class reporting; held-out macro-F1 at or above 0.75 (mean of three seeds, 95% CI)</w:t>
             </w:r>
           </w:p>
         </w:tc>
@@ -3285,7 +3285,7 @@
                 <w:sz w:val="18"/>
                 <w:szCs w:val="18"/>
               </w:rPr>
-              <w:t xml:space="preserve">M3 arbitrates conflicts among accept A, accept B, merge, or escalate</w:t>
+              <w:t>M3 merge arbitration: evaluate four candidates and integrate the verified validation winner</w:t>
             </w:r>
           </w:p>
         </w:tc>
@@ -3315,7 +3315,7 @@
                 <w:sz w:val="18"/>
                 <w:szCs w:val="18"/>
               </w:rPr>
-              <w:t xml:space="preserve">Macro-F1 of at least 0.70, and fewer harmful outcomes than a last-writer-wins baseline</w:t>
+              <w:t>Four candidates share frozen conflict cases and harness; winner locked on validation macro-F1 with harmful-merge and escalation guardrails; held-out macro-F1 at or above 0.70 and fewer harmful outcomes than last-writer-wins</w:t>
             </w:r>
           </w:p>
         </w:tc>
@@ -3380,7 +3380,7 @@
                 <w:sz w:val="18"/>
                 <w:szCs w:val="18"/>
               </w:rPr>
-              <w:t xml:space="preserve">M4 decomposes a task and routes subtasks by skill, workload, and cost</w:t>
+              <w:t>M4 decompose and route: evaluate four candidates and integrate the verified validation winner</w:t>
             </w:r>
           </w:p>
         </w:tc>
@@ -3410,7 +3410,7 @@
                 <w:sz w:val="18"/>
                 <w:szCs w:val="18"/>
               </w:rPr>
-              <w:t xml:space="preserve">Compared with a rules-only router on task quality and cost in the controlled study</w:t>
+              <w:t>Four candidates share frozen routing examples and harness; DAG validity gates eligibility; winner locked on validation routing accuracy with latency and cost; compared with rules-only in the controlled study</w:t>
             </w:r>
           </w:p>
         </w:tc>
@@ -5644,7 +5644,7 @@
                 <w:sz w:val="18"/>
                 <w:szCs w:val="18"/>
               </w:rPr>
-              <w:t>M1 catch-up summarizer (ModernBERT / Qwen / Gemma bake-off; winner by ROUGE-L)</w:t>
+              <w:t>M1 four-candidate bake-off artifacts (configs, results, comparison, model card, verification, serving adapter for the locked winner)</w:t>
             </w:r>
           </w:p>
         </w:tc>
@@ -5769,7 +5769,7 @@
                 <w:sz w:val="18"/>
                 <w:szCs w:val="18"/>
               </w:rPr>
-              <w:t xml:space="preserve">M2 intent attribution, M3 merge arbitration, M4 decomposition and routing</w:t>
+              <w:t>M2, M3, and M4 four-candidate bake-off artifacts and verified serving adapters for each locked winner</w:t>
             </w:r>
           </w:p>
         </w:tc>
@@ -7717,7 +7717,7 @@
                 <w:sz w:val="18"/>
                 <w:szCs w:val="18"/>
               </w:rPr>
-              <w:t xml:space="preserve">Choice</w:t>
+              <w:t>Planned comparison</w:t>
             </w:r>
           </w:p>
         </w:tc>
@@ -7845,7 +7845,7 @@
                 <w:sz w:val="18"/>
                 <w:szCs w:val="18"/>
               </w:rPr>
-              <w:t>Four-candidate bake-off: ModernBERT extractive [15] and Qwen/Gemma LoRA adapters [16], [10]; winner by ROUGE-L</w:t>
+              <w:t>Best of four candidates (winner unknown until validation bake-off)</w:t>
             </w:r>
           </w:p>
         </w:tc>
@@ -7875,7 +7875,7 @@
                 <w:sz w:val="18"/>
                 <w:szCs w:val="18"/>
               </w:rPr>
-              <w:t xml:space="preserve">ModernBERT's 8,192 token context admits a long event window without chunking, and adapter-only generation keeps training inside our compute budget. Full encoder-decoder fine-tuning was rejected on compute grounds, as described in 2.2.5</w:t>
+              <w:t>Four arms span an extractive control and generative LoRA adapters at matched sizes. The winner is locked on validation ROUGE-L under a factuality guardrail before held-out test.</w:t>
             </w:r>
           </w:p>
         </w:tc>
@@ -7970,7 +7970,7 @@
                 <w:sz w:val="18"/>
                 <w:szCs w:val="18"/>
               </w:rPr>
-              <w:t xml:space="preserve">ModernBERT cross-encoder</w:t>
+              <w:t>Best of four candidates (winner unknown until validation bake-off)</w:t>
             </w:r>
           </w:p>
         </w:tc>
@@ -8000,7 +8000,7 @@
                 <w:sz w:val="18"/>
                 <w:szCs w:val="18"/>
               </w:rPr>
-              <w:t xml:space="preserve">A cross-encoder jointly reads the instruction and the candidate participant, which fits pairwise classification with limited labels. ModernBERT is preferred to DeBERTa-v3 [11] because attribution reads twenty prior events and a 512 token limit would force chunking</w:t>
+              <w:t>Arms include a classical control and learned encoders so the comparison is empirical, not assumed. Macro-F1 on validation selects the winner with per-class reporting.</w:t>
             </w:r>
           </w:p>
         </w:tc>
@@ -8095,7 +8095,7 @@
                 <w:sz w:val="18"/>
                 <w:szCs w:val="18"/>
               </w:rPr>
-              <w:t xml:space="preserve">Cross-encoder with an escalate option</w:t>
+              <w:t>Best of four candidates (winner unknown until validation bake-off)</w:t>
             </w:r>
           </w:p>
         </w:tc>
@@ -8125,7 +8125,7 @@
                 <w:sz w:val="18"/>
                 <w:szCs w:val="18"/>
               </w:rPr>
-              <w:t xml:space="preserve">Last-writer-wins is the baseline to beat. An abstention option lowers harmful outcomes by escalating rather than guessing when confidence is low</w:t>
+              <w:t>Last-writer-wins is retained as a control arm. Learned and prompted arms compete under identical data and metrics; harmful-merge and escalation guardrails apply.</w:t>
             </w:r>
           </w:p>
         </w:tc>
@@ -8220,7 +8220,7 @@
                 <w:sz w:val="18"/>
                 <w:szCs w:val="18"/>
               </w:rPr>
-              <w:t xml:space="preserve">LLM planner with a learned router</w:t>
+              <w:t>Best of four candidates (winner unknown until validation bake-off)</w:t>
             </w:r>
           </w:p>
         </w:tc>
@@ -8250,7 +8250,7 @@
                 <w:sz w:val="18"/>
                 <w:szCs w:val="18"/>
               </w:rPr>
-              <w:t xml:space="preserve">The planner decomposes the task; the router assigns work using skill, workload, and cost signals that a static rule set cannot weigh</w:t>
+              <w:t>Rules-only routing is a control arm. Planner and router variants are compared after a DAG-validity gate; routing accuracy, latency, and cost break ties.</w:t>
             </w:r>
           </w:p>
         </w:tc>
@@ -11941,7 +11941,7 @@
                 <w:sz w:val="18"/>
                 <w:szCs w:val="18"/>
               </w:rPr>
-              <w:t xml:space="preserve">ROUGE-L at or above 28.2</w:t>
+              <w:t>Four-candidate bake-off; held-out ROUGE-L at or above 28.2 after validation winner lock</w:t>
             </w:r>
           </w:p>
         </w:tc>
@@ -12066,7 +12066,7 @@
                 <w:sz w:val="18"/>
                 <w:szCs w:val="18"/>
               </w:rPr>
-              <w:t xml:space="preserve">Macro-F1 at or above 0.75</w:t>
+              <w:t>Four-candidate bake-off; held-out macro-F1 at or above 0.75 after validation winner lock</w:t>
             </w:r>
           </w:p>
         </w:tc>
@@ -12191,7 +12191,7 @@
                 <w:sz w:val="18"/>
                 <w:szCs w:val="18"/>
               </w:rPr>
-              <w:t xml:space="preserve">Macro-F1 at or above 0.70, and fewer harmful outcomes than last-writer-wins</w:t>
+              <w:t>Four-candidate bake-off; held-out macro-F1 at or above 0.70 after validation winner lock, and fewer harmful outcomes than last-writer-wins</w:t>
             </w:r>
           </w:p>
         </w:tc>
@@ -12659,7 +12659,7 @@
           <w:sz w:val="22"/>
           <w:szCs w:val="22"/>
         </w:rPr>
-        <w:t xml:space="preserve">Two of these deserve explanation because they are deliberately weaker than they might appear. The judge consistency criterion claims no threshold, because agreement against machine-generated labels measures pipeline fidelity rather than correctness and should not be mistaken for the published result. The Model 1 threshold is set at the scale of the published QMSum result rather than above it, because QMSum is supervision for this project and not a baseline to beat; the comparison establishes that our summarizer is competitive on a public task before it is applied to session state, which is the task we actually care about and for which no public benchmark exists.</w:t>
+        <w:t>Two of these deserve explanation because they are deliberately weaker than they might appear. The judge consistency criterion claims no threshold, because agreement against machine-generated labels measures pipeline fidelity rather than correctness and should not be mistaken for the published result. The Model 1 threshold is set at the scale of the published QMSum result rather than above it, because QMSum is supervision for this project and not a baseline to beat; the comparison establishes that our summarizer is competitive on a public task before it is applied to session state, which is the task we actually care about and for which no public benchmark exists. The M1 figure applies to the locked bake-off winner after validation selection, not to a pre-chosen architecture.</w:t>
       </w:r>
     </w:p>
     <w:p>
@@ -16181,7 +16181,7 @@
                 <w:sz w:val="18"/>
                 <w:szCs w:val="18"/>
               </w:rPr>
-              <w:t xml:space="preserve">Sixteen Linear issues, reviewed integration action list</w:t>
+              <w:t>Sixteen MAST baseline issues reviewed; integration action list</w:t>
             </w:r>
           </w:p>
         </w:tc>
@@ -16306,7 +16306,7 @@
                 <w:sz w:val="18"/>
                 <w:szCs w:val="18"/>
               </w:rPr>
-              <w:t>ModernBERT / Qwen / Gemma LoRA bake-off; winner by ROUGE-L</w:t>
+              <w:t>Four M1 configs, bake-off results, winner model card, verification, serving adapter</w:t>
             </w:r>
           </w:p>
         </w:tc>
@@ -16431,7 +16431,7 @@
                 <w:sz w:val="18"/>
                 <w:szCs w:val="18"/>
               </w:rPr>
-              <w:t xml:space="preserve">ModernBERT cross-encoder</w:t>
+              <w:t>Four M2 configs, bake-off results, winner model card, verification, serving adapter</w:t>
             </w:r>
           </w:p>
         </w:tc>
@@ -16556,7 +16556,7 @@
                 <w:sz w:val="18"/>
                 <w:szCs w:val="18"/>
               </w:rPr>
-              <w:t xml:space="preserve">Cross-encoder with escalate option</w:t>
+              <w:t>Four M3 configs, bake-off results, winner model card, verification, serving adapter</w:t>
             </w:r>
           </w:p>
         </w:tc>
@@ -16681,7 +16681,7 @@
                 <w:sz w:val="18"/>
                 <w:szCs w:val="18"/>
               </w:rPr>
-              <w:t xml:space="preserve">LLM planner with learned router</w:t>
+              <w:t>Four M4 configs, bake-off results, winner model card, verification, serving adapter</w:t>
             </w:r>
           </w:p>
         </w:tc>
@@ -18871,7 +18871,7 @@
           <w:sz w:val="22"/>
           <w:szCs w:val="22"/>
         </w:rPr>
-        <w:t xml:space="preserve">The baseline reproduction is broken into sixteen Linear issues, DAT-25 through DAT-41, each recording its objective, the work required, acceptance criteria, the evidence required for closure, a named reviewer, and the issues that block it. The dependency structure is real rather than decorative: the final evaluation runs under DAT-36 are blocked by the clean-environment validation under DAT-27, which is blocked by the judge interface under DAT-26, which is blocked by the pinned environment under DAT-25. Stating that chain in advance made the sequencing visible before it became a problem.</w:t>
+        <w:t>The baseline reproduction is broken into sixteen Linear issues (DAT-25 through DAT-39 and DAT-41; DAT-40 is M3 configuration work and is excluded), each recording its objective, the work required, acceptance criteria, the evidence required for closure, a named reviewer, and the issues that block it. The dependency structure is real rather than decorative: the final evaluation runs under DAT-36 are blocked by the clean-environment validation under DAT-27, which is blocked by the judge interface under DAT-26, which is blocked by the pinned environment under DAT-25. Stating that chain in advance made the sequencing visible before it became a problem.</w:t>
       </w:r>
     </w:p>
     <w:p>
@@ -20560,7 +20560,7 @@
           <w:sz w:val="22"/>
           <w:szCs w:val="22"/>
         </w:rPr>
-        <w:t>What the project needs is roughly sixty GPU-hours of wall time across DATA 298A. Model 1 is the largest single item, since it is the only model trained in this semester. Models 2 and 3 are base-size encoders trained on a few thousand examples and require under two GPU-hours per seed, which at three seeds each is a small fraction of the total. The baseline reproduction requires no GPU time, because it is an inference-only pipeline whose cost is API calls rather than training.</w:t>
+        <w:t>What the project needs is separated by semester. DATA 298A needs GPU time mainly for the four-candidate M1 bake-off, smoke tests, reruns, and winner verification, on the order of tens of GPU-hours of wall time on the university GPU lab. DATA 298B covers M2 and M3 bake-offs, ablations, and final comparative runs. The MAST judge, M4 planner calls, and agent-runtime prompts are API costs rather than GPU training time. Across both semesters the training wall time remains on the order of about sixty GPU-hours in aggregate, at $0 GPU cost in the university GPU lab.</w:t>
       </w:r>
     </w:p>
     <w:p>
@@ -21790,7 +21790,7 @@
           <w:sz w:val="22"/>
           <w:szCs w:val="22"/>
         </w:rPr>
-        <w:t xml:space="preserve">Figure 1 is the Gantt chart for DATA 298A, with tasks, timeline, responsible team members, and the status of each deliverable. Figure 2 is the PERT chart, giving durations, earliest start and finish, slack, and the critical path.</w:t>
+        <w:t>Figure 1 is the Gantt chart for DATA 298A, with tasks, timeline, responsible team members, and the status of each deliverable. Model workstreams follow data preparation, four-candidate bake-off, one-winner selection, independent verification, and winner integration. Figure 2 is the PERT chart, giving durations, earliest start and finish, slack, and the project critical path. The project critical path is event schema, integration gate, session collection, annotation and frozen splits, controlled study, and defence. MAST reproduction is an important parallel workstream and is not the product critical path.</w:t>
       </w:r>
     </w:p>
     <w:p>
@@ -21852,7 +21852,7 @@
           <w:sz w:val="20"/>
           <w:szCs w:val="20"/>
         </w:rPr>
-        <w:t xml:space="preserve">Figure 1. Gantt chart (tasks, timeline, owners, and status).</w:t>
+        <w:t>Figure 1. Gantt chart (tasks, timeline, owners, and status), including four-candidate bake-offs per model.</w:t>
       </w:r>
     </w:p>
     <w:p>
@@ -21914,7 +21914,7 @@
           <w:sz w:val="20"/>
           <w:szCs w:val="20"/>
         </w:rPr>
-        <w:t xml:space="preserve">Figure 2. PERT chart with durations, earliest start and finish, slack, and critical path.</w:t>
+        <w:t>Figure 2. PERT chart with durations, earliest start and finish, slack, and the project critical path (MAST shown as a parallel workstream).</w:t>
       </w:r>
     </w:p>
     <w:p>

</xml_diff>

<commit_message>
docs: update CONTEXT.md with meeting notes, EDA summary, and gpu lab details; fix notebook gpu assertions
</commit_message>
<xml_diff>
--- a/docs/reports/T4.A4.docx
+++ b/docs/reports/T4.A4.docx
@@ -22979,583 +22979,6 @@
         <w:t>: Evaluating the collaboration and competition of LLM agents," arXiv:2503.01935, 2025. [Online]. Available: https://arxiv.org/abs/2503.01935.</w:t>
       </w:r>
     </w:p>
-    <w:p>
-      <w:pPr>
-        <w:pStyle w:val="Heading1"/>
-        <w:keepNext/>
-      </w:pPr>
-      <w:r>
-        <w:lastRenderedPageBreak/>
-        <w:t>Submission checklist (not part of the report)</w:t>
-      </w:r>
-    </w:p>
-    <w:p>
-      <w:r>
-        <w:t>Complete this before submission. This checklist stays with the workbook and is not pasted into the final report.</w:t>
-      </w:r>
-    </w:p>
-    <w:tbl>
-      <w:tblPr>
-        <w:tblW w:w="0" w:type="auto"/>
-        <w:jc w:val="center"/>
-        <w:tblBorders>
-          <w:top w:val="single" w:sz="4" w:space="0" w:color="B7B7B7"/>
-          <w:left w:val="single" w:sz="4" w:space="0" w:color="B7B7B7"/>
-          <w:bottom w:val="single" w:sz="4" w:space="0" w:color="B7B7B7"/>
-          <w:right w:val="single" w:sz="4" w:space="0" w:color="B7B7B7"/>
-          <w:insideH w:val="single" w:sz="4" w:space="0" w:color="B7B7B7"/>
-          <w:insideV w:val="single" w:sz="4" w:space="0" w:color="B7B7B7"/>
-        </w:tblBorders>
-        <w:tblCellMar>
-          <w:left w:w="10" w:type="dxa"/>
-          <w:right w:w="10" w:type="dxa"/>
-        </w:tblCellMar>
-        <w:tblLook w:val="04A0" w:firstRow="1" w:lastRow="0" w:firstColumn="1" w:lastColumn="0" w:noHBand="0" w:noVBand="1"/>
-      </w:tblPr>
-      <w:tblGrid>
-        <w:gridCol w:w="4675"/>
-        <w:gridCol w:w="4675"/>
-      </w:tblGrid>
-      <w:tr>
-        <w:tblPrEx>
-          <w:tblCellMar>
-            <w:top w:w="0" w:type="dxa"/>
-            <w:bottom w:w="0" w:type="dxa"/>
-          </w:tblCellMar>
-        </w:tblPrEx>
-        <w:trPr>
-          <w:jc w:val="center"/>
-        </w:trPr>
-        <w:tc>
-          <w:tcPr>
-            <w:tcW w:w="4680" w:type="dxa"/>
-            <w:shd w:val="clear" w:color="auto" w:fill="D9EAF7"/>
-            <w:vAlign w:val="center"/>
-          </w:tcPr>
-          <w:p>
-            <w:r>
-              <w:rPr>
-                <w:b/>
-              </w:rPr>
-              <w:t>Check</w:t>
-            </w:r>
-          </w:p>
-        </w:tc>
-        <w:tc>
-          <w:tcPr>
-            <w:tcW w:w="4680" w:type="dxa"/>
-            <w:shd w:val="clear" w:color="auto" w:fill="D9EAF7"/>
-            <w:vAlign w:val="center"/>
-          </w:tcPr>
-          <w:p>
-            <w:r>
-              <w:rPr>
-                <w:b/>
-              </w:rPr>
-              <w:t>Yes / No</w:t>
-            </w:r>
-          </w:p>
-        </w:tc>
-      </w:tr>
-      <w:tr>
-        <w:tblPrEx>
-          <w:tblCellMar>
-            <w:top w:w="0" w:type="dxa"/>
-            <w:bottom w:w="0" w:type="dxa"/>
-          </w:tblCellMar>
-        </w:tblPrEx>
-        <w:trPr>
-          <w:jc w:val="center"/>
-        </w:trPr>
-        <w:tc>
-          <w:tcPr>
-            <w:tcW w:w="4680" w:type="dxa"/>
-            <w:vAlign w:val="center"/>
-          </w:tcPr>
-          <w:p>
-            <w:r>
-              <w:t>Every section above is written as report prose, not as notes</w:t>
-            </w:r>
-          </w:p>
-        </w:tc>
-        <w:tc>
-          <w:tcPr>
-            <w:tcW w:w="4680" w:type="dxa"/>
-            <w:vAlign w:val="center"/>
-          </w:tcPr>
-          <w:p>
-            <w:r>
-              <w:t>Yes</w:t>
-            </w:r>
-          </w:p>
-        </w:tc>
-      </w:tr>
-      <w:tr>
-        <w:tblPrEx>
-          <w:tblCellMar>
-            <w:top w:w="0" w:type="dxa"/>
-            <w:bottom w:w="0" w:type="dxa"/>
-          </w:tblCellMar>
-        </w:tblPrEx>
-        <w:trPr>
-          <w:jc w:val="center"/>
-        </w:trPr>
-        <w:tc>
-          <w:tcPr>
-            <w:tcW w:w="4680" w:type="dxa"/>
-            <w:vAlign w:val="center"/>
-          </w:tcPr>
-          <w:p>
-            <w:r>
-              <w:t>Every claim links to a commit, run, dataset version, or Linear issue</w:t>
-            </w:r>
-          </w:p>
-        </w:tc>
-        <w:tc>
-          <w:tcPr>
-            <w:tcW w:w="4680" w:type="dxa"/>
-            <w:vAlign w:val="center"/>
-          </w:tcPr>
-          <w:p>
-            <w:r>
-              <w:t>Yes</w:t>
-            </w:r>
-          </w:p>
-        </w:tc>
-      </w:tr>
-      <w:tr>
-        <w:tblPrEx>
-          <w:tblCellMar>
-            <w:top w:w="0" w:type="dxa"/>
-            <w:bottom w:w="0" w:type="dxa"/>
-          </w:tblCellMar>
-        </w:tblPrEx>
-        <w:trPr>
-          <w:jc w:val="center"/>
-        </w:trPr>
-        <w:tc>
-          <w:tcPr>
-            <w:tcW w:w="4680" w:type="dxa"/>
-            <w:vAlign w:val="center"/>
-          </w:tcPr>
-          <w:p>
-            <w:r>
-              <w:t xml:space="preserve">Every figure </w:t>
-            </w:r>
-            <w:proofErr w:type="gramStart"/>
-            <w:r>
-              <w:t>names</w:t>
-            </w:r>
-            <w:proofErr w:type="gramEnd"/>
-            <w:r>
-              <w:t xml:space="preserve"> the script or notebook that produced it</w:t>
-            </w:r>
-          </w:p>
-        </w:tc>
-        <w:tc>
-          <w:tcPr>
-            <w:tcW w:w="4680" w:type="dxa"/>
-            <w:vAlign w:val="center"/>
-          </w:tcPr>
-          <w:p>
-            <w:r>
-              <w:t>Yes</w:t>
-            </w:r>
-          </w:p>
-        </w:tc>
-      </w:tr>
-      <w:tr>
-        <w:tblPrEx>
-          <w:tblCellMar>
-            <w:top w:w="0" w:type="dxa"/>
-            <w:bottom w:w="0" w:type="dxa"/>
-          </w:tblCellMar>
-        </w:tblPrEx>
-        <w:trPr>
-          <w:jc w:val="center"/>
-        </w:trPr>
-        <w:tc>
-          <w:tcPr>
-            <w:tcW w:w="4680" w:type="dxa"/>
-            <w:vAlign w:val="center"/>
-          </w:tcPr>
-          <w:p>
-            <w:r>
-              <w:t>Every closed Linear issue for this period has a linked artifact</w:t>
-            </w:r>
-          </w:p>
-        </w:tc>
-        <w:tc>
-          <w:tcPr>
-            <w:tcW w:w="4680" w:type="dxa"/>
-            <w:vAlign w:val="center"/>
-          </w:tcPr>
-          <w:p>
-            <w:r>
-              <w:t>Yes</w:t>
-            </w:r>
-          </w:p>
-        </w:tc>
-      </w:tr>
-      <w:tr>
-        <w:tblPrEx>
-          <w:tblCellMar>
-            <w:top w:w="0" w:type="dxa"/>
-            <w:bottom w:w="0" w:type="dxa"/>
-          </w:tblCellMar>
-        </w:tblPrEx>
-        <w:trPr>
-          <w:jc w:val="center"/>
-        </w:trPr>
-        <w:tc>
-          <w:tcPr>
-            <w:tcW w:w="4680" w:type="dxa"/>
-            <w:vAlign w:val="center"/>
-          </w:tcPr>
-          <w:p>
-            <w:r>
-              <w:t>Each section names the team member who wrote it</w:t>
-            </w:r>
-          </w:p>
-        </w:tc>
-        <w:tc>
-          <w:tcPr>
-            <w:tcW w:w="4680" w:type="dxa"/>
-            <w:vAlign w:val="center"/>
-          </w:tcPr>
-          <w:p>
-            <w:r>
-              <w:t>Yes</w:t>
-            </w:r>
-          </w:p>
-        </w:tc>
-      </w:tr>
-    </w:tbl>
-    <w:p>
-      <w:pPr>
-        <w:pStyle w:val="Heading1"/>
-        <w:keepNext/>
-      </w:pPr>
-      <w:r>
-        <w:t>Self-assessment and gap register</w:t>
-      </w:r>
-    </w:p>
-    <w:p>
-      <w:r>
-        <w:t>Any row below good has an owner and a delivery date so that it can be checked at the Team Meeting.</w:t>
-      </w:r>
-    </w:p>
-    <w:tbl>
-      <w:tblPr>
-        <w:tblW w:w="0" w:type="auto"/>
-        <w:jc w:val="center"/>
-        <w:tblBorders>
-          <w:top w:val="single" w:sz="4" w:space="0" w:color="B7B7B7"/>
-          <w:left w:val="single" w:sz="4" w:space="0" w:color="B7B7B7"/>
-          <w:bottom w:val="single" w:sz="4" w:space="0" w:color="B7B7B7"/>
-          <w:right w:val="single" w:sz="4" w:space="0" w:color="B7B7B7"/>
-          <w:insideH w:val="single" w:sz="4" w:space="0" w:color="B7B7B7"/>
-          <w:insideV w:val="single" w:sz="4" w:space="0" w:color="B7B7B7"/>
-        </w:tblBorders>
-        <w:tblCellMar>
-          <w:left w:w="10" w:type="dxa"/>
-          <w:right w:w="10" w:type="dxa"/>
-        </w:tblCellMar>
-        <w:tblLook w:val="04A0" w:firstRow="1" w:lastRow="0" w:firstColumn="1" w:lastColumn="0" w:noHBand="0" w:noVBand="1"/>
-      </w:tblPr>
-      <w:tblGrid>
-        <w:gridCol w:w="1870"/>
-        <w:gridCol w:w="1870"/>
-        <w:gridCol w:w="1871"/>
-        <w:gridCol w:w="1869"/>
-        <w:gridCol w:w="1870"/>
-      </w:tblGrid>
-      <w:tr>
-        <w:tblPrEx>
-          <w:tblCellMar>
-            <w:top w:w="0" w:type="dxa"/>
-            <w:bottom w:w="0" w:type="dxa"/>
-          </w:tblCellMar>
-        </w:tblPrEx>
-        <w:trPr>
-          <w:jc w:val="center"/>
-        </w:trPr>
-        <w:tc>
-          <w:tcPr>
-            <w:tcW w:w="1872" w:type="dxa"/>
-            <w:shd w:val="clear" w:color="auto" w:fill="D9EAF7"/>
-            <w:vAlign w:val="center"/>
-          </w:tcPr>
-          <w:p>
-            <w:r>
-              <w:rPr>
-                <w:b/>
-              </w:rPr>
-              <w:t>Report section</w:t>
-            </w:r>
-          </w:p>
-        </w:tc>
-        <w:tc>
-          <w:tcPr>
-            <w:tcW w:w="1872" w:type="dxa"/>
-            <w:shd w:val="clear" w:color="auto" w:fill="D9EAF7"/>
-            <w:vAlign w:val="center"/>
-          </w:tcPr>
-          <w:p>
-            <w:r>
-              <w:rPr>
-                <w:b/>
-              </w:rPr>
-              <w:t>Our rating</w:t>
-            </w:r>
-          </w:p>
-        </w:tc>
-        <w:tc>
-          <w:tcPr>
-            <w:tcW w:w="1872" w:type="dxa"/>
-            <w:shd w:val="clear" w:color="auto" w:fill="D9EAF7"/>
-            <w:vAlign w:val="center"/>
-          </w:tcPr>
-          <w:p>
-            <w:r>
-              <w:rPr>
-                <w:b/>
-              </w:rPr>
-              <w:t>If below good: what is missing</w:t>
-            </w:r>
-          </w:p>
-        </w:tc>
-        <w:tc>
-          <w:tcPr>
-            <w:tcW w:w="1872" w:type="dxa"/>
-            <w:shd w:val="clear" w:color="auto" w:fill="D9EAF7"/>
-            <w:vAlign w:val="center"/>
-          </w:tcPr>
-          <w:p>
-            <w:r>
-              <w:rPr>
-                <w:b/>
-              </w:rPr>
-              <w:t>Owner</w:t>
-            </w:r>
-          </w:p>
-        </w:tc>
-        <w:tc>
-          <w:tcPr>
-            <w:tcW w:w="1872" w:type="dxa"/>
-            <w:shd w:val="clear" w:color="auto" w:fill="D9EAF7"/>
-            <w:vAlign w:val="center"/>
-          </w:tcPr>
-          <w:p>
-            <w:r>
-              <w:rPr>
-                <w:b/>
-              </w:rPr>
-              <w:t>Lands by</w:t>
-            </w:r>
-          </w:p>
-        </w:tc>
-      </w:tr>
-      <w:tr>
-        <w:tblPrEx>
-          <w:tblCellMar>
-            <w:top w:w="0" w:type="dxa"/>
-            <w:bottom w:w="0" w:type="dxa"/>
-          </w:tblCellMar>
-        </w:tblPrEx>
-        <w:trPr>
-          <w:jc w:val="center"/>
-        </w:trPr>
-        <w:tc>
-          <w:tcPr>
-            <w:tcW w:w="1872" w:type="dxa"/>
-            <w:vAlign w:val="center"/>
-          </w:tcPr>
-          <w:p>
-            <w:r>
-              <w:t>1.1–1.5</w:t>
-            </w:r>
-          </w:p>
-        </w:tc>
-        <w:tc>
-          <w:tcPr>
-            <w:tcW w:w="1872" w:type="dxa"/>
-            <w:vAlign w:val="center"/>
-          </w:tcPr>
-          <w:p>
-            <w:r>
-              <w:t>Good</w:t>
-            </w:r>
-          </w:p>
-        </w:tc>
-        <w:tc>
-          <w:tcPr>
-            <w:tcW w:w="1872" w:type="dxa"/>
-            <w:vAlign w:val="center"/>
-          </w:tcPr>
-          <w:p>
-            <w:r>
-              <w:t>M2–M4 candidate identities remain provisional until 298B experiment planning.</w:t>
-            </w:r>
-          </w:p>
-        </w:tc>
-        <w:tc>
-          <w:tcPr>
-            <w:tcW w:w="1872" w:type="dxa"/>
-            <w:vAlign w:val="center"/>
-          </w:tcPr>
-          <w:p>
-            <w:r>
-              <w:t>Model owners</w:t>
-            </w:r>
-          </w:p>
-        </w:tc>
-        <w:tc>
-          <w:tcPr>
-            <w:tcW w:w="1872" w:type="dxa"/>
-            <w:vAlign w:val="center"/>
-          </w:tcPr>
-          <w:p>
-            <w:r>
-              <w:t>Before 298B experiments</w:t>
-            </w:r>
-          </w:p>
-        </w:tc>
-      </w:tr>
-      <w:tr>
-        <w:tblPrEx>
-          <w:tblCellMar>
-            <w:top w:w="0" w:type="dxa"/>
-            <w:bottom w:w="0" w:type="dxa"/>
-          </w:tblCellMar>
-        </w:tblPrEx>
-        <w:trPr>
-          <w:jc w:val="center"/>
-        </w:trPr>
-        <w:tc>
-          <w:tcPr>
-            <w:tcW w:w="1872" w:type="dxa"/>
-            <w:vAlign w:val="center"/>
-          </w:tcPr>
-          <w:p>
-            <w:r>
-              <w:t>2.1–2.4</w:t>
-            </w:r>
-          </w:p>
-        </w:tc>
-        <w:tc>
-          <w:tcPr>
-            <w:tcW w:w="1872" w:type="dxa"/>
-            <w:vAlign w:val="center"/>
-          </w:tcPr>
-          <w:p>
-            <w:r>
-              <w:t>Needs revision</w:t>
-            </w:r>
-          </w:p>
-        </w:tc>
-        <w:tc>
-          <w:tcPr>
-            <w:tcW w:w="1872" w:type="dxa"/>
-            <w:vAlign w:val="center"/>
-          </w:tcPr>
-          <w:p>
-            <w:r>
-              <w:t>Frozen MAST evaluation manifest and supporting evidence links still need verification.</w:t>
-            </w:r>
-          </w:p>
-        </w:tc>
-        <w:tc>
-          <w:tcPr>
-            <w:tcW w:w="1872" w:type="dxa"/>
-            <w:vAlign w:val="center"/>
-          </w:tcPr>
-          <w:p>
-            <w:r>
-              <w:t>Naman / issue owners</w:t>
-            </w:r>
-          </w:p>
-        </w:tc>
-        <w:tc>
-          <w:tcPr>
-            <w:tcW w:w="1872" w:type="dxa"/>
-            <w:vAlign w:val="center"/>
-          </w:tcPr>
-          <w:p>
-            <w:r>
-              <w:t>Before baseline final runs</w:t>
-            </w:r>
-          </w:p>
-        </w:tc>
-      </w:tr>
-      <w:tr>
-        <w:tblPrEx>
-          <w:tblCellMar>
-            <w:top w:w="0" w:type="dxa"/>
-            <w:bottom w:w="0" w:type="dxa"/>
-          </w:tblCellMar>
-        </w:tblPrEx>
-        <w:trPr>
-          <w:jc w:val="center"/>
-        </w:trPr>
-        <w:tc>
-          <w:tcPr>
-            <w:tcW w:w="1872" w:type="dxa"/>
-            <w:vAlign w:val="center"/>
-          </w:tcPr>
-          <w:p>
-            <w:r>
-              <w:t>References</w:t>
-            </w:r>
-          </w:p>
-        </w:tc>
-        <w:tc>
-          <w:tcPr>
-            <w:tcW w:w="1872" w:type="dxa"/>
-            <w:vAlign w:val="center"/>
-          </w:tcPr>
-          <w:p>
-            <w:r>
-              <w:t>Good</w:t>
-            </w:r>
-          </w:p>
-        </w:tc>
-        <w:tc>
-          <w:tcPr>
-            <w:tcW w:w="1872" w:type="dxa"/>
-            <w:vAlign w:val="center"/>
-          </w:tcPr>
-          <w:p>
-            <w:r>
-              <w:t>Pin exact model-card revisions when final candidate configurations are locked.</w:t>
-            </w:r>
-          </w:p>
-        </w:tc>
-        <w:tc>
-          <w:tcPr>
-            <w:tcW w:w="1872" w:type="dxa"/>
-            <w:vAlign w:val="center"/>
-          </w:tcPr>
-          <w:p>
-            <w:r>
-              <w:t>Model owners</w:t>
-            </w:r>
-          </w:p>
-        </w:tc>
-        <w:tc>
-          <w:tcPr>
-            <w:tcW w:w="1872" w:type="dxa"/>
-            <w:vAlign w:val="center"/>
-          </w:tcPr>
-          <w:p>
-            <w:r>
-              <w:t>Before first candidate run</w:t>
-            </w:r>
-          </w:p>
-        </w:tc>
-      </w:tr>
-    </w:tbl>
-    <w:p/>
     <w:sectPr>
       <w:headerReference w:type="default" r:id="rId9"/>
       <w:footerReference w:type="default" r:id="rId10"/>

</xml_diff>